<commit_message>
Adatbazis jelszo visszaallitassal + uj diagram + fejlesztoi dokumentacio adatmodell reszletezes es hibak javitasa + felhasznaloi dokumentacio hibak javitasa
</commit_message>
<xml_diff>
--- a/Fejlesztői_Dokumentáció.docx
+++ b/Fejlesztői_Dokumentáció.docx
@@ -478,7 +478,7 @@
     </w:p>
     <w:p>
       <w:pPr>
-        <w:pStyle w:val="Heading1"/>
+        <w:pStyle w:val="Cmsor1"/>
         <w:rPr>
           <w:rFonts w:ascii="Times New Roman" w:hAnsi="Times New Roman" w:cs="Times New Roman"/>
           <w:b/>
@@ -499,143 +499,205 @@
       <w:pPr>
         <w:rPr>
           <w:rFonts w:ascii="Times New Roman" w:hAnsi="Times New Roman" w:cs="Times New Roman"/>
-          <w:sz w:val="28"/>
-          <w:szCs w:val="28"/>
-        </w:rPr>
-      </w:pPr>
-      <w:r>
-        <w:rPr>
-          <w:rFonts w:ascii="Times New Roman" w:hAnsi="Times New Roman" w:cs="Times New Roman"/>
-          <w:sz w:val="28"/>
-          <w:szCs w:val="28"/>
-        </w:rPr>
-        <w:t>Minden ember életében részt ve</w:t>
-      </w:r>
-      <w:r>
-        <w:rPr>
-          <w:rFonts w:ascii="Times New Roman" w:hAnsi="Times New Roman" w:cs="Times New Roman"/>
-          <w:sz w:val="28"/>
-          <w:szCs w:val="28"/>
-        </w:rPr>
-        <w:t>sz</w:t>
-      </w:r>
-      <w:r>
-        <w:rPr>
-          <w:rFonts w:ascii="Times New Roman" w:hAnsi="Times New Roman" w:cs="Times New Roman"/>
-          <w:sz w:val="28"/>
-          <w:szCs w:val="28"/>
-        </w:rPr>
-        <w:t xml:space="preserve"> az online vásárlás, emiatt vizsgaremekünk témájának egy webshop elkészítését választott</w:t>
-      </w:r>
-      <w:r>
-        <w:rPr>
-          <w:rFonts w:ascii="Times New Roman" w:hAnsi="Times New Roman" w:cs="Times New Roman"/>
-          <w:sz w:val="28"/>
-          <w:szCs w:val="28"/>
-        </w:rPr>
-        <w:t>unk</w:t>
-      </w:r>
-      <w:r>
-        <w:rPr>
-          <w:rFonts w:ascii="Times New Roman" w:hAnsi="Times New Roman" w:cs="Times New Roman"/>
-          <w:sz w:val="28"/>
-          <w:szCs w:val="28"/>
-        </w:rPr>
-        <w:t>. Az már nehezebb döntés volt, hogy mit áruljon az ár</w:t>
-      </w:r>
-      <w:r>
-        <w:rPr>
-          <w:rFonts w:ascii="Times New Roman" w:hAnsi="Times New Roman" w:cs="Times New Roman"/>
-          <w:sz w:val="28"/>
-          <w:szCs w:val="28"/>
+          <w:sz w:val="24"/>
+          <w:szCs w:val="24"/>
+        </w:rPr>
+      </w:pPr>
+      <w:r>
+        <w:rPr>
+          <w:rFonts w:ascii="Times New Roman" w:hAnsi="Times New Roman" w:cs="Times New Roman"/>
+          <w:sz w:val="24"/>
+          <w:szCs w:val="24"/>
+        </w:rPr>
+        <w:t>Mivel az online vásárlás ma már mindenki életének része, vizsgaremekünk témájául</w:t>
+      </w:r>
+      <w:r>
+        <w:rPr>
+          <w:rFonts w:ascii="Times New Roman" w:hAnsi="Times New Roman" w:cs="Times New Roman"/>
+          <w:sz w:val="24"/>
+          <w:szCs w:val="24"/>
+        </w:rPr>
+        <w:t xml:space="preserve"> egy webshop elkészítését választottuk.</w:t>
+      </w:r>
+      <w:r>
+        <w:rPr>
+          <w:rFonts w:ascii="Times New Roman" w:hAnsi="Times New Roman" w:cs="Times New Roman"/>
+          <w:sz w:val="24"/>
+          <w:szCs w:val="24"/>
+        </w:rPr>
+        <w:t xml:space="preserve"> </w:t>
+      </w:r>
+      <w:r>
+        <w:rPr>
+          <w:rFonts w:ascii="Times New Roman" w:hAnsi="Times New Roman" w:cs="Times New Roman"/>
+          <w:sz w:val="24"/>
+          <w:szCs w:val="24"/>
+        </w:rPr>
+        <w:t>Nehezebb döntésnek bizonyult azonban</w:t>
+      </w:r>
+      <w:r>
+        <w:rPr>
+          <w:rFonts w:ascii="Times New Roman" w:hAnsi="Times New Roman" w:cs="Times New Roman"/>
+          <w:sz w:val="24"/>
+          <w:szCs w:val="24"/>
+        </w:rPr>
+        <w:t>, hogy mit áruljon az ár</w:t>
+      </w:r>
+      <w:r>
+        <w:rPr>
+          <w:rFonts w:ascii="Times New Roman" w:hAnsi="Times New Roman" w:cs="Times New Roman"/>
+          <w:sz w:val="24"/>
+          <w:szCs w:val="24"/>
         </w:rPr>
         <w:t>u</w:t>
       </w:r>
       <w:r>
         <w:rPr>
           <w:rFonts w:ascii="Times New Roman" w:hAnsi="Times New Roman" w:cs="Times New Roman"/>
-          <w:sz w:val="28"/>
-          <w:szCs w:val="28"/>
+          <w:sz w:val="24"/>
+          <w:szCs w:val="24"/>
         </w:rPr>
         <w:t>ház, ám végül arra jutottunk</w:t>
       </w:r>
       <w:r>
         <w:rPr>
           <w:rFonts w:ascii="Times New Roman" w:hAnsi="Times New Roman" w:cs="Times New Roman"/>
-          <w:sz w:val="28"/>
-          <w:szCs w:val="28"/>
-        </w:rPr>
-        <w:t>, hogy a webshop vadászati eszközöket és kiegészítőket áruljon.</w:t>
-      </w:r>
-    </w:p>
-    <w:p>
-      <w:pPr>
-        <w:rPr>
-          <w:rFonts w:ascii="Times New Roman" w:hAnsi="Times New Roman" w:cs="Times New Roman"/>
-          <w:sz w:val="28"/>
-          <w:szCs w:val="28"/>
-        </w:rPr>
-      </w:pPr>
-      <w:r>
-        <w:rPr>
-          <w:rFonts w:ascii="Times New Roman" w:hAnsi="Times New Roman" w:cs="Times New Roman"/>
-          <w:sz w:val="28"/>
-          <w:szCs w:val="28"/>
-        </w:rPr>
-        <w:t>A vadászat onnan jön, hogy egyes csapattársak ismerősei vadászattal foglalkoznak</w:t>
-      </w:r>
-      <w:r>
-        <w:rPr>
-          <w:rFonts w:ascii="Times New Roman" w:hAnsi="Times New Roman" w:cs="Times New Roman"/>
-          <w:sz w:val="28"/>
-          <w:szCs w:val="28"/>
-        </w:rPr>
-        <w:t>, és érdekesnek hangzik ez az elfoglaltság</w:t>
-      </w:r>
-      <w:r>
-        <w:rPr>
-          <w:rFonts w:ascii="Times New Roman" w:hAnsi="Times New Roman" w:cs="Times New Roman"/>
-          <w:sz w:val="28"/>
-          <w:szCs w:val="28"/>
+          <w:sz w:val="24"/>
+          <w:szCs w:val="24"/>
+        </w:rPr>
+        <w:t>, hogy a</w:t>
+      </w:r>
+      <w:r>
+        <w:rPr>
+          <w:rFonts w:ascii="Times New Roman" w:hAnsi="Times New Roman" w:cs="Times New Roman"/>
+          <w:sz w:val="24"/>
+          <w:szCs w:val="24"/>
+        </w:rPr>
+        <w:t xml:space="preserve">z online platform </w:t>
+      </w:r>
+      <w:r>
+        <w:rPr>
+          <w:rFonts w:ascii="Times New Roman" w:hAnsi="Times New Roman" w:cs="Times New Roman"/>
+          <w:sz w:val="24"/>
+          <w:szCs w:val="24"/>
+        </w:rPr>
+        <w:t>vadászati eszközöket és kiegészítőket áru</w:t>
+      </w:r>
+      <w:r>
+        <w:rPr>
+          <w:rFonts w:ascii="Times New Roman" w:hAnsi="Times New Roman" w:cs="Times New Roman"/>
+          <w:sz w:val="24"/>
+          <w:szCs w:val="24"/>
+        </w:rPr>
+        <w:t>sítson</w:t>
+      </w:r>
+      <w:r>
+        <w:rPr>
+          <w:rFonts w:ascii="Times New Roman" w:hAnsi="Times New Roman" w:cs="Times New Roman"/>
+          <w:sz w:val="24"/>
+          <w:szCs w:val="24"/>
+        </w:rPr>
+        <w:t>.</w:t>
+      </w:r>
+    </w:p>
+    <w:p>
+      <w:pPr>
+        <w:rPr>
+          <w:rFonts w:ascii="Times New Roman" w:hAnsi="Times New Roman" w:cs="Times New Roman"/>
+          <w:sz w:val="24"/>
+          <w:szCs w:val="24"/>
+        </w:rPr>
+      </w:pPr>
+      <w:r>
+        <w:rPr>
+          <w:rFonts w:ascii="Times New Roman" w:hAnsi="Times New Roman" w:cs="Times New Roman"/>
+          <w:sz w:val="24"/>
+          <w:szCs w:val="24"/>
+        </w:rPr>
+        <w:t>Választásunkat befolyásolta, hogy</w:t>
+      </w:r>
+      <w:r>
+        <w:rPr>
+          <w:rFonts w:ascii="Times New Roman" w:hAnsi="Times New Roman" w:cs="Times New Roman"/>
+          <w:sz w:val="24"/>
+          <w:szCs w:val="24"/>
+        </w:rPr>
+        <w:t xml:space="preserve"> </w:t>
+      </w:r>
+      <w:r>
+        <w:rPr>
+          <w:rFonts w:ascii="Times New Roman" w:hAnsi="Times New Roman" w:cs="Times New Roman"/>
+          <w:sz w:val="24"/>
+          <w:szCs w:val="24"/>
+        </w:rPr>
+        <w:t>egyes csapattársak ismerősei vadászattal foglalkoznak</w:t>
+      </w:r>
+      <w:r>
+        <w:rPr>
+          <w:rFonts w:ascii="Times New Roman" w:hAnsi="Times New Roman" w:cs="Times New Roman"/>
+          <w:sz w:val="24"/>
+          <w:szCs w:val="24"/>
+        </w:rPr>
+        <w:t xml:space="preserve">, és </w:t>
+      </w:r>
+      <w:r>
+        <w:rPr>
+          <w:rFonts w:ascii="Times New Roman" w:hAnsi="Times New Roman" w:cs="Times New Roman"/>
+          <w:sz w:val="24"/>
+          <w:szCs w:val="24"/>
+        </w:rPr>
+        <w:t>rendkívül érdekes</w:t>
+      </w:r>
+      <w:r>
+        <w:rPr>
+          <w:rFonts w:ascii="Times New Roman" w:hAnsi="Times New Roman" w:cs="Times New Roman"/>
+          <w:sz w:val="24"/>
+          <w:szCs w:val="24"/>
+        </w:rPr>
+        <w:t>nek</w:t>
+      </w:r>
+      <w:r>
+        <w:rPr>
+          <w:rFonts w:ascii="Times New Roman" w:hAnsi="Times New Roman" w:cs="Times New Roman"/>
+          <w:sz w:val="24"/>
+          <w:szCs w:val="24"/>
+        </w:rPr>
+        <w:t xml:space="preserve"> találtuk ezt a tevékenységet</w:t>
+      </w:r>
+      <w:r>
+        <w:rPr>
+          <w:rFonts w:ascii="Times New Roman" w:hAnsi="Times New Roman" w:cs="Times New Roman"/>
+          <w:sz w:val="24"/>
+          <w:szCs w:val="24"/>
+        </w:rPr>
+        <w:t>.</w:t>
+      </w:r>
+      <w:r>
+        <w:rPr>
+          <w:rFonts w:ascii="Times New Roman" w:hAnsi="Times New Roman" w:cs="Times New Roman"/>
+          <w:sz w:val="24"/>
+          <w:szCs w:val="24"/>
         </w:rPr>
         <w:t xml:space="preserve">                                                                 </w:t>
       </w:r>
     </w:p>
     <w:p>
       <w:pPr>
-        <w:pStyle w:val="NormalWeb"/>
-        <w:rPr>
-          <w:sz w:val="28"/>
-          <w:szCs w:val="28"/>
-        </w:rPr>
-      </w:pPr>
-      <w:r>
-        <w:rPr>
-          <w:sz w:val="28"/>
-          <w:szCs w:val="28"/>
-        </w:rPr>
-        <w:t xml:space="preserve">Összességében azért választottuk ezt a témát, mert komplex feladatként jól bemutatja a tudásunkat, miközben egy kézzelfogható, saját </w:t>
-      </w:r>
-      <w:proofErr w:type="spellStart"/>
-      <w:r>
-        <w:rPr>
-          <w:sz w:val="28"/>
-          <w:szCs w:val="28"/>
-        </w:rPr>
-        <w:t>készítésű</w:t>
-      </w:r>
-      <w:proofErr w:type="spellEnd"/>
-      <w:r>
-        <w:rPr>
-          <w:sz w:val="28"/>
-          <w:szCs w:val="28"/>
-        </w:rPr>
-        <w:t xml:space="preserve"> eredményt hoztunk létre. </w:t>
-      </w:r>
-    </w:p>
-    <w:p>
-      <w:pPr>
-        <w:pStyle w:val="Heading1"/>
+        <w:pStyle w:val="NormlWeb"/>
+      </w:pPr>
+      <w:r>
+        <w:t>Összességében azért választottuk ezt a témát, mert komplex feladatként jól bemutatja a tudásunkat, miközben egy kézzelfogható, saját készítésű eredményt hoztunk létre</w:t>
+      </w:r>
+      <w:r>
+        <w:t xml:space="preserve"> a projekt során</w:t>
+      </w:r>
+      <w:r>
+        <w:t xml:space="preserve">. </w:t>
+      </w:r>
+    </w:p>
+    <w:p>
+      <w:pPr>
+        <w:pStyle w:val="Cmsor1"/>
         <w:rPr>
           <w:rFonts w:ascii="Times New Roman" w:hAnsi="Times New Roman" w:cs="Times New Roman"/>
           <w:b/>
@@ -653,7 +715,7 @@
     </w:p>
     <w:p>
       <w:pPr>
-        <w:pStyle w:val="ListParagraph"/>
+        <w:pStyle w:val="Listaszerbekezds"/>
         <w:numPr>
           <w:ilvl w:val="0"/>
           <w:numId w:val="1"/>
@@ -675,7 +737,7 @@
     </w:p>
     <w:p>
       <w:pPr>
-        <w:pStyle w:val="ListParagraph"/>
+        <w:pStyle w:val="Listaszerbekezds"/>
         <w:numPr>
           <w:ilvl w:val="0"/>
           <w:numId w:val="1"/>
@@ -697,7 +759,7 @@
     </w:p>
     <w:p>
       <w:pPr>
-        <w:pStyle w:val="ListParagraph"/>
+        <w:pStyle w:val="Listaszerbekezds"/>
         <w:numPr>
           <w:ilvl w:val="0"/>
           <w:numId w:val="1"/>
@@ -719,7 +781,7 @@
     </w:p>
     <w:p>
       <w:pPr>
-        <w:pStyle w:val="ListParagraph"/>
+        <w:pStyle w:val="Listaszerbekezds"/>
         <w:numPr>
           <w:ilvl w:val="0"/>
           <w:numId w:val="1"/>
@@ -741,7 +803,7 @@
     </w:p>
     <w:p>
       <w:pPr>
-        <w:pStyle w:val="ListParagraph"/>
+        <w:pStyle w:val="Listaszerbekezds"/>
         <w:numPr>
           <w:ilvl w:val="0"/>
           <w:numId w:val="1"/>
@@ -765,7 +827,7 @@
     </w:p>
     <w:p>
       <w:pPr>
-        <w:pStyle w:val="ListParagraph"/>
+        <w:pStyle w:val="Listaszerbekezds"/>
         <w:numPr>
           <w:ilvl w:val="0"/>
           <w:numId w:val="1"/>
@@ -815,7 +877,7 @@
     </w:p>
     <w:p>
       <w:pPr>
-        <w:pStyle w:val="ListParagraph"/>
+        <w:pStyle w:val="Listaszerbekezds"/>
         <w:numPr>
           <w:ilvl w:val="0"/>
           <w:numId w:val="1"/>
@@ -837,7 +899,7 @@
     </w:p>
     <w:p>
       <w:pPr>
-        <w:pStyle w:val="ListParagraph"/>
+        <w:pStyle w:val="Listaszerbekezds"/>
         <w:numPr>
           <w:ilvl w:val="0"/>
           <w:numId w:val="1"/>
@@ -861,7 +923,7 @@
     </w:p>
     <w:p>
       <w:pPr>
-        <w:pStyle w:val="ListParagraph"/>
+        <w:pStyle w:val="Listaszerbekezds"/>
         <w:numPr>
           <w:ilvl w:val="0"/>
           <w:numId w:val="1"/>
@@ -885,7 +947,7 @@
     </w:p>
     <w:p>
       <w:pPr>
-        <w:pStyle w:val="ListParagraph"/>
+        <w:pStyle w:val="Listaszerbekezds"/>
         <w:numPr>
           <w:ilvl w:val="0"/>
           <w:numId w:val="1"/>
@@ -915,7 +977,7 @@
       <w:hyperlink r:id="rId5" w:history="1">
         <w:r>
           <w:rPr>
-            <w:rStyle w:val="Hyperlink"/>
+            <w:rStyle w:val="Hiperhivatkozs"/>
             <w:rFonts w:ascii="Segoe UI" w:hAnsi="Segoe UI" w:cs="Segoe UI"/>
             <w:color w:val="0969DA"/>
             <w:shd w:val="clear" w:color="auto" w:fill="FFFFFF"/>
@@ -929,7 +991,7 @@
     </w:p>
     <w:p>
       <w:pPr>
-        <w:pStyle w:val="Heading1"/>
+        <w:pStyle w:val="Cmsor1"/>
         <w:rPr>
           <w:rFonts w:ascii="Times New Roman" w:hAnsi="Times New Roman" w:cs="Times New Roman"/>
           <w:b/>
@@ -945,14 +1007,149 @@
         <w:t>Adatmodell leírása:</w:t>
       </w:r>
     </w:p>
-    <w:p/>
-    <w:p>
-      <w:pPr>
-        <w:pStyle w:val="Heading1"/>
+    <w:p>
+      <w:pPr>
+        <w:rPr>
+          <w:rFonts w:ascii="Times New Roman" w:hAnsi="Times New Roman" w:cs="Times New Roman"/>
+          <w:sz w:val="24"/>
+          <w:szCs w:val="24"/>
+        </w:rPr>
+      </w:pPr>
+      <w:r>
+        <w:rPr>
+          <w:rFonts w:ascii="Times New Roman" w:hAnsi="Times New Roman" w:cs="Times New Roman"/>
+          <w:sz w:val="24"/>
+          <w:szCs w:val="24"/>
+        </w:rPr>
+        <w:t xml:space="preserve">Az Arany Agancs webshop adatbázisa </w:t>
+      </w:r>
+      <w:proofErr w:type="spellStart"/>
+      <w:r>
+        <w:rPr>
+          <w:rFonts w:ascii="Times New Roman" w:hAnsi="Times New Roman" w:cs="Times New Roman"/>
+          <w:sz w:val="24"/>
+          <w:szCs w:val="24"/>
+        </w:rPr>
+        <w:t>MariaDB</w:t>
+      </w:r>
+      <w:proofErr w:type="spellEnd"/>
+      <w:r>
+        <w:rPr>
+          <w:rFonts w:ascii="Times New Roman" w:hAnsi="Times New Roman" w:cs="Times New Roman"/>
+          <w:sz w:val="24"/>
+          <w:szCs w:val="24"/>
+        </w:rPr>
+        <w:t xml:space="preserve"> alapon készült, utf8mb4_hungarian_ci karakterkészlettel, amely lehetővé teszi a magyar ékezetes karakterek helyes kezelését. Az adatbázis </w:t>
+      </w:r>
+      <w:r>
+        <w:rPr>
+          <w:rFonts w:ascii="Times New Roman" w:hAnsi="Times New Roman" w:cs="Times New Roman"/>
+          <w:sz w:val="24"/>
+          <w:szCs w:val="24"/>
+        </w:rPr>
+        <w:t>10</w:t>
+      </w:r>
+      <w:r>
+        <w:rPr>
+          <w:rFonts w:ascii="Times New Roman" w:hAnsi="Times New Roman" w:cs="Times New Roman"/>
+          <w:sz w:val="24"/>
+          <w:szCs w:val="24"/>
+        </w:rPr>
+        <w:t xml:space="preserve"> táblából áll, amelyek együttesen lefedik a webshop teljes működését: a felhasználókezeléstől a rendelések nyomkövetésén át a </w:t>
+      </w:r>
+      <w:r>
+        <w:rPr>
+          <w:rFonts w:ascii="Times New Roman" w:hAnsi="Times New Roman" w:cs="Times New Roman"/>
+          <w:sz w:val="24"/>
+          <w:szCs w:val="24"/>
+        </w:rPr>
+        <w:t>termékkatalógusig</w:t>
+      </w:r>
+      <w:r>
+        <w:rPr>
+          <w:rFonts w:ascii="Times New Roman" w:hAnsi="Times New Roman" w:cs="Times New Roman"/>
+          <w:sz w:val="24"/>
+          <w:szCs w:val="24"/>
+        </w:rPr>
+        <w:t>.</w:t>
+      </w:r>
+    </w:p>
+    <w:p>
+      <w:r>
+        <w:lastRenderedPageBreak/>
+        <w:drawing>
+          <wp:anchor distT="0" distB="0" distL="114300" distR="114300" simplePos="0" relativeHeight="251660288" behindDoc="0" locked="0" layoutInCell="1" allowOverlap="1" wp14:anchorId="4B11E9E6" wp14:editId="491B9ED0">
+            <wp:simplePos x="0" y="0"/>
+            <wp:positionH relativeFrom="margin">
+              <wp:align>right</wp:align>
+            </wp:positionH>
+            <wp:positionV relativeFrom="paragraph">
+              <wp:posOffset>0</wp:posOffset>
+            </wp:positionV>
+            <wp:extent cx="5730875" cy="2819400"/>
+            <wp:effectExtent l="0" t="0" r="3175" b="0"/>
+            <wp:wrapSquare wrapText="bothSides"/>
+            <wp:docPr id="1517072443" name="Kép 5"/>
+            <wp:cNvGraphicFramePr>
+              <a:graphicFrameLocks xmlns:a="http://schemas.openxmlformats.org/drawingml/2006/main" noChangeAspect="1"/>
+            </wp:cNvGraphicFramePr>
+            <a:graphic xmlns:a="http://schemas.openxmlformats.org/drawingml/2006/main">
+              <a:graphicData uri="http://schemas.openxmlformats.org/drawingml/2006/picture">
+                <pic:pic xmlns:pic="http://schemas.openxmlformats.org/drawingml/2006/picture">
+                  <pic:nvPicPr>
+                    <pic:cNvPr id="0" name="Picture 13"/>
+                    <pic:cNvPicPr>
+                      <a:picLocks noChangeAspect="1" noChangeArrowheads="1"/>
+                    </pic:cNvPicPr>
+                  </pic:nvPicPr>
+                  <pic:blipFill>
+                    <a:blip r:embed="rId6" cstate="print">
+                      <a:extLst>
+                        <a:ext uri="{28A0092B-C50C-407E-A947-70E740481C1C}">
+                          <a14:useLocalDpi xmlns:a14="http://schemas.microsoft.com/office/drawing/2010/main" val="0"/>
+                        </a:ext>
+                      </a:extLst>
+                    </a:blip>
+                    <a:srcRect/>
+                    <a:stretch>
+                      <a:fillRect/>
+                    </a:stretch>
+                  </pic:blipFill>
+                  <pic:spPr bwMode="auto">
+                    <a:xfrm>
+                      <a:off x="0" y="0"/>
+                      <a:ext cx="5730875" cy="2819400"/>
+                    </a:xfrm>
+                    <a:prstGeom prst="rect">
+                      <a:avLst/>
+                    </a:prstGeom>
+                    <a:noFill/>
+                    <a:ln>
+                      <a:noFill/>
+                    </a:ln>
+                  </pic:spPr>
+                </pic:pic>
+              </a:graphicData>
+            </a:graphic>
+            <wp14:sizeRelH relativeFrom="margin">
+              <wp14:pctWidth>0</wp14:pctWidth>
+            </wp14:sizeRelH>
+            <wp14:sizeRelV relativeFrom="margin">
+              <wp14:pctHeight>0</wp14:pctHeight>
+            </wp14:sizeRelV>
+          </wp:anchor>
+        </w:drawing>
+      </w:r>
+    </w:p>
+    <w:p>
+      <w:pPr>
+        <w:spacing w:after="0"/>
         <w:rPr>
           <w:rFonts w:ascii="Times New Roman" w:hAnsi="Times New Roman" w:cs="Times New Roman"/>
           <w:b/>
           <w:bCs/>
+          <w:sz w:val="26"/>
+          <w:szCs w:val="26"/>
         </w:rPr>
       </w:pPr>
       <w:r>
@@ -960,21 +1157,1650 @@
           <w:rFonts w:ascii="Times New Roman" w:hAnsi="Times New Roman" w:cs="Times New Roman"/>
           <w:b/>
           <w:bCs/>
-        </w:rPr>
-        <w:t>Részletes feladatspecifikáció</w:t>
-      </w:r>
-      <w:r>
+          <w:sz w:val="26"/>
+          <w:szCs w:val="26"/>
+        </w:rPr>
+        <w:t>Táblák leírása:</w:t>
+      </w:r>
+    </w:p>
+    <w:p>
+      <w:pPr>
+        <w:spacing w:afterLines="160" w:after="384"/>
+        <w:rPr>
+          <w:rFonts w:ascii="Times New Roman" w:hAnsi="Times New Roman" w:cs="Times New Roman"/>
+          <w:sz w:val="24"/>
+          <w:szCs w:val="24"/>
+          <w:u w:val="single"/>
+        </w:rPr>
+      </w:pPr>
+      <w:proofErr w:type="spellStart"/>
+      <w:r>
+        <w:rPr>
+          <w:rFonts w:ascii="Times New Roman" w:hAnsi="Times New Roman" w:cs="Times New Roman"/>
+          <w:sz w:val="24"/>
+          <w:szCs w:val="24"/>
+          <w:u w:val="single"/>
+        </w:rPr>
+        <w:t>felhasznalo</w:t>
+      </w:r>
+      <w:proofErr w:type="spellEnd"/>
+    </w:p>
+    <w:p>
+      <w:pPr>
+        <w:rPr>
+          <w:rFonts w:ascii="Times New Roman" w:hAnsi="Times New Roman" w:cs="Times New Roman"/>
+          <w:sz w:val="24"/>
+          <w:szCs w:val="24"/>
+        </w:rPr>
+      </w:pPr>
+      <w:r>
+        <w:rPr>
+          <w:rFonts w:ascii="Times New Roman" w:hAnsi="Times New Roman" w:cs="Times New Roman"/>
+          <w:sz w:val="24"/>
+          <w:szCs w:val="24"/>
+        </w:rPr>
+        <w:t xml:space="preserve">A felhasználó tábla tárolja az oldal összes regisztrált felhasználójának adatait. Az elsődleges kulcs a </w:t>
+      </w:r>
+      <w:proofErr w:type="spellStart"/>
+      <w:r>
+        <w:rPr>
+          <w:rFonts w:ascii="Times New Roman" w:hAnsi="Times New Roman" w:cs="Times New Roman"/>
+          <w:sz w:val="24"/>
+          <w:szCs w:val="24"/>
+        </w:rPr>
+        <w:t>felhasznalonev</w:t>
+      </w:r>
+      <w:proofErr w:type="spellEnd"/>
+      <w:r>
+        <w:rPr>
+          <w:rFonts w:ascii="Times New Roman" w:hAnsi="Times New Roman" w:cs="Times New Roman"/>
+          <w:sz w:val="24"/>
+          <w:szCs w:val="24"/>
+        </w:rPr>
+        <w:t xml:space="preserve"> mező, amely egyedi azonosítóként szolgál. A </w:t>
+      </w:r>
+      <w:proofErr w:type="spellStart"/>
+      <w:r>
+        <w:rPr>
+          <w:rFonts w:ascii="Times New Roman" w:hAnsi="Times New Roman" w:cs="Times New Roman"/>
+          <w:sz w:val="24"/>
+          <w:szCs w:val="24"/>
+        </w:rPr>
+        <w:t>jelszo</w:t>
+      </w:r>
+      <w:proofErr w:type="spellEnd"/>
+      <w:r>
+        <w:rPr>
+          <w:rFonts w:ascii="Times New Roman" w:hAnsi="Times New Roman" w:cs="Times New Roman"/>
+          <w:sz w:val="24"/>
+          <w:szCs w:val="24"/>
+        </w:rPr>
+        <w:t xml:space="preserve"> mező bcrypt </w:t>
+      </w:r>
+      <w:r>
+        <w:rPr>
+          <w:rFonts w:ascii="Times New Roman" w:hAnsi="Times New Roman" w:cs="Times New Roman"/>
+          <w:sz w:val="24"/>
+          <w:szCs w:val="24"/>
+        </w:rPr>
+        <w:t>algoritmussal</w:t>
+      </w:r>
+      <w:r>
+        <w:rPr>
+          <w:rFonts w:ascii="Times New Roman" w:hAnsi="Times New Roman" w:cs="Times New Roman"/>
+          <w:sz w:val="24"/>
+          <w:szCs w:val="24"/>
+        </w:rPr>
+        <w:t xml:space="preserve"> van hashelve, ez biztosítja a jelszavak biztonságos tárolását. A tábla tartalmaz számlázási cím adatokat is (ország, irányítószám, város, utca), amelyek a rendelések során kerülnek felhasználásra. A </w:t>
+      </w:r>
+      <w:proofErr w:type="spellStart"/>
+      <w:r>
+        <w:rPr>
+          <w:rFonts w:ascii="Times New Roman" w:hAnsi="Times New Roman" w:cs="Times New Roman"/>
+          <w:sz w:val="24"/>
+          <w:szCs w:val="24"/>
+        </w:rPr>
+        <w:t>rangId</w:t>
+      </w:r>
+      <w:proofErr w:type="spellEnd"/>
+      <w:r>
+        <w:rPr>
+          <w:rFonts w:ascii="Times New Roman" w:hAnsi="Times New Roman" w:cs="Times New Roman"/>
+          <w:sz w:val="24"/>
+          <w:szCs w:val="24"/>
+        </w:rPr>
+        <w:t xml:space="preserve"> idegen kulcsként kapcsolódik a rang táblához, meghatározva a felhasználó jogosultsági szintjét.</w:t>
+      </w:r>
+    </w:p>
+    <w:p>
+      <w:pPr>
+        <w:rPr>
+          <w:rFonts w:ascii="Times New Roman" w:hAnsi="Times New Roman" w:cs="Times New Roman"/>
+          <w:sz w:val="24"/>
+          <w:szCs w:val="24"/>
+          <w:u w:val="single"/>
+        </w:rPr>
+      </w:pPr>
+      <w:r>
+        <w:rPr>
+          <w:rFonts w:ascii="Times New Roman" w:hAnsi="Times New Roman" w:cs="Times New Roman"/>
+          <w:sz w:val="24"/>
+          <w:szCs w:val="24"/>
+          <w:u w:val="single"/>
+        </w:rPr>
+        <w:t>rang</w:t>
+      </w:r>
+    </w:p>
+    <w:p>
+      <w:pPr>
+        <w:rPr>
+          <w:rFonts w:ascii="Times New Roman" w:hAnsi="Times New Roman" w:cs="Times New Roman"/>
+          <w:sz w:val="24"/>
+          <w:szCs w:val="24"/>
+        </w:rPr>
+      </w:pPr>
+      <w:r>
+        <w:rPr>
+          <w:rFonts w:ascii="Times New Roman" w:hAnsi="Times New Roman" w:cs="Times New Roman"/>
+          <w:sz w:val="24"/>
+          <w:szCs w:val="24"/>
+        </w:rPr>
+        <w:t>A rang tábla a rendszer jogosultsági szintjeit határozza meg. Három szerepkört tartalmaz: Admin (1), Dolgozó (2) és Vásárló (3). Ez a háromszintű rendszer lehetővé teszi, hogy az adminisztrátorok teljes hozzáféréssel rendelkezzenek, a dolgozók kezeljék a rendeléseket, a vásárlók pedig csak a saját fiókjukhoz és a vásárláshoz kapcsolódó funkciókhoz férhessenek hozzá.</w:t>
+      </w:r>
+    </w:p>
+    <w:p>
+      <w:pPr>
+        <w:rPr>
+          <w:rFonts w:ascii="Times New Roman" w:hAnsi="Times New Roman" w:cs="Times New Roman"/>
+          <w:sz w:val="24"/>
+          <w:szCs w:val="24"/>
+          <w:u w:val="single"/>
+        </w:rPr>
+      </w:pPr>
+      <w:proofErr w:type="spellStart"/>
+      <w:r>
+        <w:rPr>
+          <w:rFonts w:ascii="Times New Roman" w:hAnsi="Times New Roman" w:cs="Times New Roman"/>
+          <w:sz w:val="24"/>
+          <w:szCs w:val="24"/>
+          <w:u w:val="single"/>
+        </w:rPr>
+        <w:t>szallitasicimek</w:t>
+      </w:r>
+      <w:proofErr w:type="spellEnd"/>
+    </w:p>
+    <w:p>
+      <w:pPr>
+        <w:rPr>
+          <w:rFonts w:ascii="Times New Roman" w:hAnsi="Times New Roman" w:cs="Times New Roman"/>
+          <w:sz w:val="24"/>
+          <w:szCs w:val="24"/>
+        </w:rPr>
+      </w:pPr>
+      <w:r>
+        <w:rPr>
+          <w:rFonts w:ascii="Times New Roman" w:hAnsi="Times New Roman" w:cs="Times New Roman"/>
+          <w:sz w:val="24"/>
+          <w:szCs w:val="24"/>
+        </w:rPr>
+        <w:t xml:space="preserve">A szállítási címek tábla a felhasználók alternatív szállítási címeit tárolja. Egy felhasználóhoz több szállítási cím is tartozhat, mivel a </w:t>
+      </w:r>
+      <w:proofErr w:type="spellStart"/>
+      <w:r>
+        <w:rPr>
+          <w:rFonts w:ascii="Times New Roman" w:hAnsi="Times New Roman" w:cs="Times New Roman"/>
+          <w:sz w:val="24"/>
+          <w:szCs w:val="24"/>
+        </w:rPr>
+        <w:t>felhasznalo</w:t>
+      </w:r>
+      <w:proofErr w:type="spellEnd"/>
+      <w:r>
+        <w:rPr>
+          <w:rFonts w:ascii="Times New Roman" w:hAnsi="Times New Roman" w:cs="Times New Roman"/>
+          <w:sz w:val="24"/>
+          <w:szCs w:val="24"/>
+        </w:rPr>
+        <w:t xml:space="preserve"> mező idegen kulcsként hivatkozik a </w:t>
+      </w:r>
+      <w:proofErr w:type="spellStart"/>
+      <w:r>
+        <w:rPr>
+          <w:rFonts w:ascii="Times New Roman" w:hAnsi="Times New Roman" w:cs="Times New Roman"/>
+          <w:sz w:val="24"/>
+          <w:szCs w:val="24"/>
+        </w:rPr>
+        <w:t>felhasznalo</w:t>
+      </w:r>
+      <w:proofErr w:type="spellEnd"/>
+      <w:r>
+        <w:rPr>
+          <w:rFonts w:ascii="Times New Roman" w:hAnsi="Times New Roman" w:cs="Times New Roman"/>
+          <w:sz w:val="24"/>
+          <w:szCs w:val="24"/>
+        </w:rPr>
+        <w:t xml:space="preserve"> táblára. A tábla tartalmaz ország, irányítószám, város és utca mezőket, amelyek a rendelés feladásakor választhatók ki szállítási címként.</w:t>
+      </w:r>
+    </w:p>
+    <w:p>
+      <w:pPr>
+        <w:rPr>
+          <w:rFonts w:ascii="Times New Roman" w:hAnsi="Times New Roman" w:cs="Times New Roman"/>
+          <w:sz w:val="24"/>
+          <w:szCs w:val="24"/>
+          <w:u w:val="single"/>
+        </w:rPr>
+      </w:pPr>
+      <w:proofErr w:type="spellStart"/>
+      <w:r>
+        <w:rPr>
+          <w:rFonts w:ascii="Times New Roman" w:hAnsi="Times New Roman" w:cs="Times New Roman"/>
+          <w:sz w:val="24"/>
+          <w:szCs w:val="24"/>
+          <w:u w:val="single"/>
+        </w:rPr>
+        <w:t>rendeles</w:t>
+      </w:r>
+      <w:proofErr w:type="spellEnd"/>
+    </w:p>
+    <w:p>
+      <w:pPr>
+        <w:rPr>
+          <w:rFonts w:ascii="Times New Roman" w:hAnsi="Times New Roman" w:cs="Times New Roman"/>
+          <w:sz w:val="24"/>
+          <w:szCs w:val="24"/>
+        </w:rPr>
+      </w:pPr>
+      <w:r>
+        <w:rPr>
+          <w:rFonts w:ascii="Times New Roman" w:hAnsi="Times New Roman" w:cs="Times New Roman"/>
+          <w:sz w:val="24"/>
+          <w:szCs w:val="24"/>
+        </w:rPr>
+        <w:t xml:space="preserve">A </w:t>
+      </w:r>
+      <w:proofErr w:type="spellStart"/>
+      <w:r>
+        <w:rPr>
+          <w:rFonts w:ascii="Times New Roman" w:hAnsi="Times New Roman" w:cs="Times New Roman"/>
+          <w:sz w:val="24"/>
+          <w:szCs w:val="24"/>
+        </w:rPr>
+        <w:t>rendeles</w:t>
+      </w:r>
+      <w:proofErr w:type="spellEnd"/>
+      <w:r>
+        <w:rPr>
+          <w:rFonts w:ascii="Times New Roman" w:hAnsi="Times New Roman" w:cs="Times New Roman"/>
+          <w:sz w:val="24"/>
+          <w:szCs w:val="24"/>
+        </w:rPr>
+        <w:t xml:space="preserve"> tábla a webshop központi eleme, amely az összes </w:t>
+      </w:r>
+      <w:r>
+        <w:rPr>
+          <w:rFonts w:ascii="Times New Roman" w:hAnsi="Times New Roman" w:cs="Times New Roman"/>
+          <w:sz w:val="24"/>
+          <w:szCs w:val="24"/>
+        </w:rPr>
+        <w:t>leadott</w:t>
+      </w:r>
+      <w:r>
+        <w:rPr>
+          <w:rFonts w:ascii="Times New Roman" w:hAnsi="Times New Roman" w:cs="Times New Roman"/>
+          <w:sz w:val="24"/>
+          <w:szCs w:val="24"/>
+        </w:rPr>
+        <w:t xml:space="preserve"> rendelést nyilvántartja. A </w:t>
+      </w:r>
+      <w:proofErr w:type="spellStart"/>
+      <w:r>
+        <w:rPr>
+          <w:rFonts w:ascii="Times New Roman" w:hAnsi="Times New Roman" w:cs="Times New Roman"/>
+          <w:sz w:val="24"/>
+          <w:szCs w:val="24"/>
+        </w:rPr>
+        <w:t>felhasznalo</w:t>
+      </w:r>
+      <w:proofErr w:type="spellEnd"/>
+      <w:r>
+        <w:rPr>
+          <w:rFonts w:ascii="Times New Roman" w:hAnsi="Times New Roman" w:cs="Times New Roman"/>
+          <w:sz w:val="24"/>
+          <w:szCs w:val="24"/>
+        </w:rPr>
+        <w:t xml:space="preserve"> mező idegen kulcsként kapcsolódik a felhasználó táblához. A fizetve (</w:t>
+      </w:r>
+      <w:proofErr w:type="spellStart"/>
+      <w:r>
+        <w:rPr>
+          <w:rFonts w:ascii="Times New Roman" w:hAnsi="Times New Roman" w:cs="Times New Roman"/>
+          <w:sz w:val="24"/>
+          <w:szCs w:val="24"/>
+        </w:rPr>
+        <w:t>tinyint</w:t>
+      </w:r>
+      <w:proofErr w:type="spellEnd"/>
+      <w:r>
+        <w:rPr>
+          <w:rFonts w:ascii="Times New Roman" w:hAnsi="Times New Roman" w:cs="Times New Roman"/>
+          <w:sz w:val="24"/>
+          <w:szCs w:val="24"/>
+        </w:rPr>
+        <w:t xml:space="preserve">) mező jelzi, hogy a rendelés ki van-e fizetve, a </w:t>
+      </w:r>
+      <w:proofErr w:type="spellStart"/>
+      <w:r>
+        <w:rPr>
+          <w:rFonts w:ascii="Times New Roman" w:hAnsi="Times New Roman" w:cs="Times New Roman"/>
+          <w:sz w:val="24"/>
+          <w:szCs w:val="24"/>
+        </w:rPr>
+        <w:t>fizetesIdeje</w:t>
+      </w:r>
+      <w:proofErr w:type="spellEnd"/>
+      <w:r>
+        <w:rPr>
+          <w:rFonts w:ascii="Times New Roman" w:hAnsi="Times New Roman" w:cs="Times New Roman"/>
+          <w:sz w:val="24"/>
+          <w:szCs w:val="24"/>
+        </w:rPr>
+        <w:t xml:space="preserve"> pedig rögzíti a fizetés pontos időpontját. Az </w:t>
+      </w:r>
+      <w:proofErr w:type="spellStart"/>
+      <w:r>
+        <w:rPr>
+          <w:rFonts w:ascii="Times New Roman" w:hAnsi="Times New Roman" w:cs="Times New Roman"/>
+          <w:sz w:val="24"/>
+          <w:szCs w:val="24"/>
+        </w:rPr>
+        <w:t>elkuldve</w:t>
+      </w:r>
+      <w:proofErr w:type="spellEnd"/>
+      <w:r>
+        <w:rPr>
+          <w:rFonts w:ascii="Times New Roman" w:hAnsi="Times New Roman" w:cs="Times New Roman"/>
+          <w:sz w:val="24"/>
+          <w:szCs w:val="24"/>
+        </w:rPr>
+        <w:t xml:space="preserve"> és </w:t>
+      </w:r>
+      <w:proofErr w:type="spellStart"/>
+      <w:r>
+        <w:rPr>
+          <w:rFonts w:ascii="Times New Roman" w:hAnsi="Times New Roman" w:cs="Times New Roman"/>
+          <w:sz w:val="24"/>
+          <w:szCs w:val="24"/>
+        </w:rPr>
+        <w:t>teljesitve</w:t>
+      </w:r>
+      <w:proofErr w:type="spellEnd"/>
+      <w:r>
+        <w:rPr>
+          <w:rFonts w:ascii="Times New Roman" w:hAnsi="Times New Roman" w:cs="Times New Roman"/>
+          <w:sz w:val="24"/>
+          <w:szCs w:val="24"/>
+        </w:rPr>
+        <w:t xml:space="preserve"> mezők a rendelés logisztikai állapotát követik nyomon: mikor küldték ki a csomagot, és mikor vette át a vásárló. A </w:t>
+      </w:r>
+      <w:proofErr w:type="spellStart"/>
+      <w:r>
+        <w:rPr>
+          <w:rFonts w:ascii="Times New Roman" w:hAnsi="Times New Roman" w:cs="Times New Roman"/>
+          <w:sz w:val="24"/>
+          <w:szCs w:val="24"/>
+        </w:rPr>
+        <w:t>szallitasId</w:t>
+      </w:r>
+      <w:proofErr w:type="spellEnd"/>
+      <w:r>
+        <w:rPr>
+          <w:rFonts w:ascii="Times New Roman" w:hAnsi="Times New Roman" w:cs="Times New Roman"/>
+          <w:sz w:val="24"/>
+          <w:szCs w:val="24"/>
+        </w:rPr>
+        <w:t xml:space="preserve"> mező az aktív szállítási címre mutat a </w:t>
+      </w:r>
+      <w:proofErr w:type="spellStart"/>
+      <w:r>
+        <w:rPr>
+          <w:rFonts w:ascii="Times New Roman" w:hAnsi="Times New Roman" w:cs="Times New Roman"/>
+          <w:sz w:val="24"/>
+          <w:szCs w:val="24"/>
+        </w:rPr>
+        <w:t>szallitasicimek</w:t>
+      </w:r>
+      <w:proofErr w:type="spellEnd"/>
+      <w:r>
+        <w:rPr>
+          <w:rFonts w:ascii="Times New Roman" w:hAnsi="Times New Roman" w:cs="Times New Roman"/>
+          <w:sz w:val="24"/>
+          <w:szCs w:val="24"/>
+        </w:rPr>
+        <w:t xml:space="preserve"> táblában.</w:t>
+      </w:r>
+    </w:p>
+    <w:p>
+      <w:pPr>
+        <w:rPr>
+          <w:rFonts w:ascii="Times New Roman" w:hAnsi="Times New Roman" w:cs="Times New Roman"/>
+          <w:sz w:val="24"/>
+          <w:szCs w:val="24"/>
+          <w:u w:val="single"/>
+        </w:rPr>
+      </w:pPr>
+      <w:proofErr w:type="spellStart"/>
+      <w:r>
+        <w:rPr>
+          <w:rFonts w:ascii="Times New Roman" w:hAnsi="Times New Roman" w:cs="Times New Roman"/>
+          <w:sz w:val="24"/>
+          <w:szCs w:val="24"/>
+          <w:u w:val="single"/>
+        </w:rPr>
+        <w:lastRenderedPageBreak/>
+        <w:t>tetelek</w:t>
+      </w:r>
+      <w:proofErr w:type="spellEnd"/>
+    </w:p>
+    <w:p>
+      <w:pPr>
+        <w:rPr>
+          <w:rFonts w:ascii="Times New Roman" w:hAnsi="Times New Roman" w:cs="Times New Roman"/>
+          <w:sz w:val="24"/>
+          <w:szCs w:val="24"/>
+        </w:rPr>
+      </w:pPr>
+      <w:r>
+        <w:rPr>
+          <w:rFonts w:ascii="Times New Roman" w:hAnsi="Times New Roman" w:cs="Times New Roman"/>
+          <w:sz w:val="24"/>
+          <w:szCs w:val="24"/>
+        </w:rPr>
+        <w:t xml:space="preserve">A </w:t>
+      </w:r>
+      <w:proofErr w:type="spellStart"/>
+      <w:r>
+        <w:rPr>
+          <w:rFonts w:ascii="Times New Roman" w:hAnsi="Times New Roman" w:cs="Times New Roman"/>
+          <w:sz w:val="24"/>
+          <w:szCs w:val="24"/>
+        </w:rPr>
+        <w:t>tetelek</w:t>
+      </w:r>
+      <w:proofErr w:type="spellEnd"/>
+      <w:r>
+        <w:rPr>
+          <w:rFonts w:ascii="Times New Roman" w:hAnsi="Times New Roman" w:cs="Times New Roman"/>
+          <w:sz w:val="24"/>
+          <w:szCs w:val="24"/>
+        </w:rPr>
+        <w:t xml:space="preserve"> tábla a rendelések és a termékek közötti kapcsoló (</w:t>
+      </w:r>
+      <w:proofErr w:type="spellStart"/>
+      <w:r>
+        <w:rPr>
+          <w:rFonts w:ascii="Times New Roman" w:hAnsi="Times New Roman" w:cs="Times New Roman"/>
+          <w:sz w:val="24"/>
+          <w:szCs w:val="24"/>
+        </w:rPr>
+        <w:t>junction</w:t>
+      </w:r>
+      <w:proofErr w:type="spellEnd"/>
+      <w:r>
+        <w:rPr>
+          <w:rFonts w:ascii="Times New Roman" w:hAnsi="Times New Roman" w:cs="Times New Roman"/>
+          <w:sz w:val="24"/>
+          <w:szCs w:val="24"/>
+        </w:rPr>
+        <w:t xml:space="preserve">) tábla, amely megvalósítja a több-a-többhöz kapcsolatot. Minden sor egy adott rendelésben szereplő terméksort: </w:t>
+      </w:r>
+      <w:proofErr w:type="spellStart"/>
+      <w:r>
+        <w:rPr>
+          <w:rFonts w:ascii="Times New Roman" w:hAnsi="Times New Roman" w:cs="Times New Roman"/>
+          <w:sz w:val="24"/>
+          <w:szCs w:val="24"/>
+        </w:rPr>
+        <w:t>rendelesId</w:t>
+      </w:r>
+      <w:proofErr w:type="spellEnd"/>
+      <w:r>
+        <w:rPr>
+          <w:rFonts w:ascii="Times New Roman" w:hAnsi="Times New Roman" w:cs="Times New Roman"/>
+          <w:sz w:val="24"/>
+          <w:szCs w:val="24"/>
+        </w:rPr>
+        <w:t xml:space="preserve"> és </w:t>
+      </w:r>
+      <w:proofErr w:type="spellStart"/>
+      <w:r>
+        <w:rPr>
+          <w:rFonts w:ascii="Times New Roman" w:hAnsi="Times New Roman" w:cs="Times New Roman"/>
+          <w:sz w:val="24"/>
+          <w:szCs w:val="24"/>
+        </w:rPr>
+        <w:t>termekId</w:t>
+      </w:r>
+      <w:proofErr w:type="spellEnd"/>
+      <w:r>
+        <w:rPr>
+          <w:rFonts w:ascii="Times New Roman" w:hAnsi="Times New Roman" w:cs="Times New Roman"/>
+          <w:sz w:val="24"/>
+          <w:szCs w:val="24"/>
+        </w:rPr>
+        <w:t xml:space="preserve"> idegen kulcsokkal azonosítja a rendelést és a terméket, a </w:t>
+      </w:r>
+      <w:proofErr w:type="spellStart"/>
+      <w:r>
+        <w:rPr>
+          <w:rFonts w:ascii="Times New Roman" w:hAnsi="Times New Roman" w:cs="Times New Roman"/>
+          <w:sz w:val="24"/>
+          <w:szCs w:val="24"/>
+        </w:rPr>
+        <w:t>mennyiseg</w:t>
+      </w:r>
+      <w:proofErr w:type="spellEnd"/>
+      <w:r>
+        <w:rPr>
+          <w:rFonts w:ascii="Times New Roman" w:hAnsi="Times New Roman" w:cs="Times New Roman"/>
+          <w:sz w:val="24"/>
+          <w:szCs w:val="24"/>
+        </w:rPr>
+        <w:t xml:space="preserve"> mező pedig megadja, hogy abban a rendelésben hány darab került megrendelésre az adott termékből.</w:t>
+      </w:r>
+    </w:p>
+    <w:p>
+      <w:pPr>
+        <w:rPr>
+          <w:rFonts w:ascii="Times New Roman" w:hAnsi="Times New Roman" w:cs="Times New Roman"/>
+          <w:sz w:val="24"/>
+          <w:szCs w:val="24"/>
+          <w:u w:val="single"/>
+        </w:rPr>
+      </w:pPr>
+      <w:r>
+        <w:rPr>
+          <w:rFonts w:ascii="Times New Roman" w:hAnsi="Times New Roman" w:cs="Times New Roman"/>
+          <w:sz w:val="24"/>
+          <w:szCs w:val="24"/>
+          <w:u w:val="single"/>
+        </w:rPr>
+        <w:t>termek</w:t>
+      </w:r>
+    </w:p>
+    <w:p>
+      <w:pPr>
+        <w:rPr>
+          <w:rFonts w:ascii="Times New Roman" w:hAnsi="Times New Roman" w:cs="Times New Roman"/>
+          <w:sz w:val="24"/>
+          <w:szCs w:val="24"/>
+        </w:rPr>
+      </w:pPr>
+      <w:r>
+        <w:rPr>
+          <w:rFonts w:ascii="Times New Roman" w:hAnsi="Times New Roman" w:cs="Times New Roman"/>
+          <w:sz w:val="24"/>
+          <w:szCs w:val="24"/>
+        </w:rPr>
+        <w:t>A termek tábla tartalmazza a webshop összes árusított termékének adatait. A név és leírás mezők kétnyelvűek (</w:t>
+      </w:r>
+      <w:proofErr w:type="spellStart"/>
+      <w:r>
+        <w:rPr>
+          <w:rFonts w:ascii="Times New Roman" w:hAnsi="Times New Roman" w:cs="Times New Roman"/>
+          <w:sz w:val="24"/>
+          <w:szCs w:val="24"/>
+        </w:rPr>
+        <w:t>nev</w:t>
+      </w:r>
+      <w:proofErr w:type="spellEnd"/>
+      <w:r>
+        <w:rPr>
+          <w:rFonts w:ascii="Times New Roman" w:hAnsi="Times New Roman" w:cs="Times New Roman"/>
+          <w:sz w:val="24"/>
+          <w:szCs w:val="24"/>
+        </w:rPr>
+        <w:t>/</w:t>
+      </w:r>
+      <w:proofErr w:type="spellStart"/>
+      <w:r>
+        <w:rPr>
+          <w:rFonts w:ascii="Times New Roman" w:hAnsi="Times New Roman" w:cs="Times New Roman"/>
+          <w:sz w:val="24"/>
+          <w:szCs w:val="24"/>
+        </w:rPr>
+        <w:t>nevEn</w:t>
+      </w:r>
+      <w:proofErr w:type="spellEnd"/>
+      <w:r>
+        <w:rPr>
+          <w:rFonts w:ascii="Times New Roman" w:hAnsi="Times New Roman" w:cs="Times New Roman"/>
+          <w:sz w:val="24"/>
+          <w:szCs w:val="24"/>
+        </w:rPr>
+        <w:t xml:space="preserve">, </w:t>
+      </w:r>
+      <w:proofErr w:type="spellStart"/>
+      <w:r>
+        <w:rPr>
+          <w:rFonts w:ascii="Times New Roman" w:hAnsi="Times New Roman" w:cs="Times New Roman"/>
+          <w:sz w:val="24"/>
+          <w:szCs w:val="24"/>
+        </w:rPr>
+        <w:t>leiras</w:t>
+      </w:r>
+      <w:proofErr w:type="spellEnd"/>
+      <w:r>
+        <w:rPr>
+          <w:rFonts w:ascii="Times New Roman" w:hAnsi="Times New Roman" w:cs="Times New Roman"/>
+          <w:sz w:val="24"/>
+          <w:szCs w:val="24"/>
+        </w:rPr>
+        <w:t>/</w:t>
+      </w:r>
+      <w:proofErr w:type="spellStart"/>
+      <w:r>
+        <w:rPr>
+          <w:rFonts w:ascii="Times New Roman" w:hAnsi="Times New Roman" w:cs="Times New Roman"/>
+          <w:sz w:val="24"/>
+          <w:szCs w:val="24"/>
+        </w:rPr>
+        <w:t>leirasEn</w:t>
+      </w:r>
+      <w:proofErr w:type="spellEnd"/>
+      <w:r>
+        <w:rPr>
+          <w:rFonts w:ascii="Times New Roman" w:hAnsi="Times New Roman" w:cs="Times New Roman"/>
+          <w:sz w:val="24"/>
+          <w:szCs w:val="24"/>
+        </w:rPr>
+        <w:t xml:space="preserve">), támogatva a magyar és angol nyelvváltást. Az </w:t>
+      </w:r>
+      <w:proofErr w:type="spellStart"/>
+      <w:r>
+        <w:rPr>
+          <w:rFonts w:ascii="Times New Roman" w:hAnsi="Times New Roman" w:cs="Times New Roman"/>
+          <w:sz w:val="24"/>
+          <w:szCs w:val="24"/>
+        </w:rPr>
+        <w:t>ar</w:t>
+      </w:r>
+      <w:proofErr w:type="spellEnd"/>
+      <w:r>
+        <w:rPr>
+          <w:rFonts w:ascii="Times New Roman" w:hAnsi="Times New Roman" w:cs="Times New Roman"/>
+          <w:sz w:val="24"/>
+          <w:szCs w:val="24"/>
+        </w:rPr>
+        <w:t xml:space="preserve"> mező tárolja az aktuális eladási árat. A </w:t>
+      </w:r>
+      <w:proofErr w:type="spellStart"/>
+      <w:r>
+        <w:rPr>
+          <w:rFonts w:ascii="Times New Roman" w:hAnsi="Times New Roman" w:cs="Times New Roman"/>
+          <w:sz w:val="24"/>
+          <w:szCs w:val="24"/>
+        </w:rPr>
+        <w:t>kategoriaId</w:t>
+      </w:r>
+      <w:proofErr w:type="spellEnd"/>
+      <w:r>
+        <w:rPr>
+          <w:rFonts w:ascii="Times New Roman" w:hAnsi="Times New Roman" w:cs="Times New Roman"/>
+          <w:sz w:val="24"/>
+          <w:szCs w:val="24"/>
+        </w:rPr>
+        <w:t xml:space="preserve"> idegen kulcsként a </w:t>
+      </w:r>
+      <w:proofErr w:type="spellStart"/>
+      <w:r>
+        <w:rPr>
+          <w:rFonts w:ascii="Times New Roman" w:hAnsi="Times New Roman" w:cs="Times New Roman"/>
+          <w:sz w:val="24"/>
+          <w:szCs w:val="24"/>
+        </w:rPr>
+        <w:t>kategoria</w:t>
+      </w:r>
+      <w:proofErr w:type="spellEnd"/>
+      <w:r>
+        <w:rPr>
+          <w:rFonts w:ascii="Times New Roman" w:hAnsi="Times New Roman" w:cs="Times New Roman"/>
+          <w:sz w:val="24"/>
+          <w:szCs w:val="24"/>
+        </w:rPr>
+        <w:t xml:space="preserve"> táblára, a </w:t>
+      </w:r>
+      <w:proofErr w:type="spellStart"/>
+      <w:r>
+        <w:rPr>
+          <w:rFonts w:ascii="Times New Roman" w:hAnsi="Times New Roman" w:cs="Times New Roman"/>
+          <w:sz w:val="24"/>
+          <w:szCs w:val="24"/>
+        </w:rPr>
+        <w:t>learazasid</w:t>
+      </w:r>
+      <w:proofErr w:type="spellEnd"/>
+      <w:r>
+        <w:rPr>
+          <w:rFonts w:ascii="Times New Roman" w:hAnsi="Times New Roman" w:cs="Times New Roman"/>
+          <w:sz w:val="24"/>
+          <w:szCs w:val="24"/>
+        </w:rPr>
+        <w:t xml:space="preserve"> a </w:t>
+      </w:r>
+      <w:proofErr w:type="spellStart"/>
+      <w:r>
+        <w:rPr>
+          <w:rFonts w:ascii="Times New Roman" w:hAnsi="Times New Roman" w:cs="Times New Roman"/>
+          <w:sz w:val="24"/>
+          <w:szCs w:val="24"/>
+        </w:rPr>
+        <w:t>learazas</w:t>
+      </w:r>
+      <w:proofErr w:type="spellEnd"/>
+      <w:r>
+        <w:rPr>
+          <w:rFonts w:ascii="Times New Roman" w:hAnsi="Times New Roman" w:cs="Times New Roman"/>
+          <w:sz w:val="24"/>
+          <w:szCs w:val="24"/>
+        </w:rPr>
+        <w:t xml:space="preserve"> táblára mutat. A </w:t>
+      </w:r>
+      <w:proofErr w:type="spellStart"/>
+      <w:r>
+        <w:rPr>
+          <w:rFonts w:ascii="Times New Roman" w:hAnsi="Times New Roman" w:cs="Times New Roman"/>
+          <w:sz w:val="24"/>
+          <w:szCs w:val="24"/>
+        </w:rPr>
+        <w:t>keszlet</w:t>
+      </w:r>
+      <w:proofErr w:type="spellEnd"/>
+      <w:r>
+        <w:rPr>
+          <w:rFonts w:ascii="Times New Roman" w:hAnsi="Times New Roman" w:cs="Times New Roman"/>
+          <w:sz w:val="24"/>
+          <w:szCs w:val="24"/>
+        </w:rPr>
+        <w:t xml:space="preserve"> mező nyilvántartja az aktuális készletet, a </w:t>
+      </w:r>
+      <w:proofErr w:type="spellStart"/>
+      <w:r>
+        <w:rPr>
+          <w:rFonts w:ascii="Times New Roman" w:hAnsi="Times New Roman" w:cs="Times New Roman"/>
+          <w:sz w:val="24"/>
+          <w:szCs w:val="24"/>
+        </w:rPr>
+        <w:t>kep</w:t>
+      </w:r>
+      <w:proofErr w:type="spellEnd"/>
+      <w:r>
+        <w:rPr>
+          <w:rFonts w:ascii="Times New Roman" w:hAnsi="Times New Roman" w:cs="Times New Roman"/>
+          <w:sz w:val="24"/>
+          <w:szCs w:val="24"/>
+        </w:rPr>
+        <w:t xml:space="preserve"> mező pedig a termék képének elérési útját tárolja.</w:t>
+      </w:r>
+    </w:p>
+    <w:p>
+      <w:pPr>
+        <w:rPr>
+          <w:rFonts w:ascii="Times New Roman" w:hAnsi="Times New Roman" w:cs="Times New Roman"/>
+          <w:sz w:val="24"/>
+          <w:szCs w:val="24"/>
+          <w:u w:val="single"/>
+        </w:rPr>
+      </w:pPr>
+      <w:proofErr w:type="spellStart"/>
+      <w:r>
+        <w:rPr>
+          <w:rFonts w:ascii="Times New Roman" w:hAnsi="Times New Roman" w:cs="Times New Roman"/>
+          <w:sz w:val="24"/>
+          <w:szCs w:val="24"/>
+          <w:u w:val="single"/>
+        </w:rPr>
+        <w:t>kategoria</w:t>
+      </w:r>
+      <w:proofErr w:type="spellEnd"/>
+    </w:p>
+    <w:p>
+      <w:pPr>
+        <w:rPr>
+          <w:rFonts w:ascii="Times New Roman" w:hAnsi="Times New Roman" w:cs="Times New Roman"/>
+          <w:sz w:val="24"/>
+          <w:szCs w:val="24"/>
+        </w:rPr>
+      </w:pPr>
+      <w:r>
+        <w:rPr>
+          <w:rFonts w:ascii="Times New Roman" w:hAnsi="Times New Roman" w:cs="Times New Roman"/>
+          <w:sz w:val="24"/>
+          <w:szCs w:val="24"/>
+        </w:rPr>
+        <w:t xml:space="preserve">A </w:t>
+      </w:r>
+      <w:proofErr w:type="spellStart"/>
+      <w:r>
+        <w:rPr>
+          <w:rFonts w:ascii="Times New Roman" w:hAnsi="Times New Roman" w:cs="Times New Roman"/>
+          <w:sz w:val="24"/>
+          <w:szCs w:val="24"/>
+        </w:rPr>
+        <w:t>kategoria</w:t>
+      </w:r>
+      <w:proofErr w:type="spellEnd"/>
+      <w:r>
+        <w:rPr>
+          <w:rFonts w:ascii="Times New Roman" w:hAnsi="Times New Roman" w:cs="Times New Roman"/>
+          <w:sz w:val="24"/>
+          <w:szCs w:val="24"/>
+        </w:rPr>
+        <w:t xml:space="preserve"> tábla a termékek csoportosítására szolgál. Minden kategória két név mezővel rendelkezik: </w:t>
+      </w:r>
+      <w:proofErr w:type="spellStart"/>
+      <w:r>
+        <w:rPr>
+          <w:rFonts w:ascii="Times New Roman" w:hAnsi="Times New Roman" w:cs="Times New Roman"/>
+          <w:sz w:val="24"/>
+          <w:szCs w:val="24"/>
+        </w:rPr>
+        <w:t>kategoria</w:t>
+      </w:r>
+      <w:proofErr w:type="spellEnd"/>
+      <w:r>
+        <w:rPr>
+          <w:rFonts w:ascii="Times New Roman" w:hAnsi="Times New Roman" w:cs="Times New Roman"/>
+          <w:sz w:val="24"/>
+          <w:szCs w:val="24"/>
+        </w:rPr>
+        <w:t xml:space="preserve"> (magyar) és </w:t>
+      </w:r>
+      <w:proofErr w:type="spellStart"/>
+      <w:r>
+        <w:rPr>
+          <w:rFonts w:ascii="Times New Roman" w:hAnsi="Times New Roman" w:cs="Times New Roman"/>
+          <w:sz w:val="24"/>
+          <w:szCs w:val="24"/>
+        </w:rPr>
+        <w:t>kategoriaEn</w:t>
+      </w:r>
+      <w:proofErr w:type="spellEnd"/>
+      <w:r>
+        <w:rPr>
+          <w:rFonts w:ascii="Times New Roman" w:hAnsi="Times New Roman" w:cs="Times New Roman"/>
+          <w:sz w:val="24"/>
+          <w:szCs w:val="24"/>
+        </w:rPr>
+        <w:t xml:space="preserve"> (angol), megvalósítva a kétnyelvű </w:t>
+      </w:r>
+      <w:r>
+        <w:rPr>
+          <w:rFonts w:ascii="Times New Roman" w:hAnsi="Times New Roman" w:cs="Times New Roman"/>
+          <w:sz w:val="24"/>
+          <w:szCs w:val="24"/>
+        </w:rPr>
+        <w:t>termék böngészést</w:t>
+      </w:r>
+      <w:r>
+        <w:rPr>
+          <w:rFonts w:ascii="Times New Roman" w:hAnsi="Times New Roman" w:cs="Times New Roman"/>
+          <w:sz w:val="24"/>
+          <w:szCs w:val="24"/>
+        </w:rPr>
+        <w:t xml:space="preserve">. A webshopban 20 kategória található, például </w:t>
+      </w:r>
+      <w:r>
+        <w:rPr>
+          <w:rFonts w:ascii="Times New Roman" w:hAnsi="Times New Roman" w:cs="Times New Roman"/>
+          <w:sz w:val="24"/>
+          <w:szCs w:val="24"/>
+        </w:rPr>
+        <w:t>v</w:t>
+      </w:r>
+      <w:r>
+        <w:rPr>
+          <w:rFonts w:ascii="Times New Roman" w:hAnsi="Times New Roman" w:cs="Times New Roman"/>
+          <w:sz w:val="24"/>
+          <w:szCs w:val="24"/>
+        </w:rPr>
+        <w:t xml:space="preserve">adászruházat, </w:t>
+      </w:r>
+      <w:r>
+        <w:rPr>
+          <w:rFonts w:ascii="Times New Roman" w:hAnsi="Times New Roman" w:cs="Times New Roman"/>
+          <w:sz w:val="24"/>
+          <w:szCs w:val="24"/>
+        </w:rPr>
+        <w:t>f</w:t>
+      </w:r>
+      <w:r>
+        <w:rPr>
+          <w:rFonts w:ascii="Times New Roman" w:hAnsi="Times New Roman" w:cs="Times New Roman"/>
+          <w:sz w:val="24"/>
+          <w:szCs w:val="24"/>
+        </w:rPr>
+        <w:t xml:space="preserve">egyver </w:t>
+      </w:r>
+      <w:r>
+        <w:rPr>
+          <w:rFonts w:ascii="Times New Roman" w:hAnsi="Times New Roman" w:cs="Times New Roman"/>
+          <w:sz w:val="24"/>
+          <w:szCs w:val="24"/>
+        </w:rPr>
+        <w:t>alkatrészek</w:t>
+      </w:r>
+      <w:r>
+        <w:rPr>
+          <w:rFonts w:ascii="Times New Roman" w:hAnsi="Times New Roman" w:cs="Times New Roman"/>
+          <w:sz w:val="24"/>
+          <w:szCs w:val="24"/>
+        </w:rPr>
+        <w:t xml:space="preserve">, </w:t>
+      </w:r>
+      <w:r>
+        <w:rPr>
+          <w:rFonts w:ascii="Times New Roman" w:hAnsi="Times New Roman" w:cs="Times New Roman"/>
+          <w:sz w:val="24"/>
+          <w:szCs w:val="24"/>
+        </w:rPr>
+        <w:t>t</w:t>
+      </w:r>
+      <w:r>
+        <w:rPr>
+          <w:rFonts w:ascii="Times New Roman" w:hAnsi="Times New Roman" w:cs="Times New Roman"/>
+          <w:sz w:val="24"/>
+          <w:szCs w:val="24"/>
+        </w:rPr>
+        <w:t xml:space="preserve">ávcsövek, </w:t>
+      </w:r>
+      <w:r>
+        <w:rPr>
+          <w:rFonts w:ascii="Times New Roman" w:hAnsi="Times New Roman" w:cs="Times New Roman"/>
+          <w:sz w:val="24"/>
+          <w:szCs w:val="24"/>
+        </w:rPr>
+        <w:t>k</w:t>
+      </w:r>
+      <w:r>
+        <w:rPr>
+          <w:rFonts w:ascii="Times New Roman" w:hAnsi="Times New Roman" w:cs="Times New Roman"/>
+          <w:sz w:val="24"/>
+          <w:szCs w:val="24"/>
+        </w:rPr>
+        <w:t>ések stb.</w:t>
+      </w:r>
+    </w:p>
+    <w:p>
+      <w:pPr>
+        <w:rPr>
+          <w:rFonts w:ascii="Times New Roman" w:hAnsi="Times New Roman" w:cs="Times New Roman"/>
+          <w:sz w:val="24"/>
+          <w:szCs w:val="24"/>
+          <w:u w:val="single"/>
+        </w:rPr>
+      </w:pPr>
+      <w:proofErr w:type="spellStart"/>
+      <w:r>
+        <w:rPr>
+          <w:rFonts w:ascii="Times New Roman" w:hAnsi="Times New Roman" w:cs="Times New Roman"/>
+          <w:sz w:val="24"/>
+          <w:szCs w:val="24"/>
+          <w:u w:val="single"/>
+        </w:rPr>
+        <w:t>learazas</w:t>
+      </w:r>
+      <w:proofErr w:type="spellEnd"/>
+    </w:p>
+    <w:p>
+      <w:pPr>
+        <w:rPr>
+          <w:rFonts w:ascii="Times New Roman" w:hAnsi="Times New Roman" w:cs="Times New Roman"/>
+          <w:sz w:val="24"/>
+          <w:szCs w:val="24"/>
+        </w:rPr>
+      </w:pPr>
+      <w:r>
+        <w:rPr>
+          <w:rFonts w:ascii="Times New Roman" w:hAnsi="Times New Roman" w:cs="Times New Roman"/>
+          <w:sz w:val="24"/>
+          <w:szCs w:val="24"/>
+        </w:rPr>
+        <w:t xml:space="preserve">A </w:t>
+      </w:r>
+      <w:proofErr w:type="spellStart"/>
+      <w:r>
+        <w:rPr>
+          <w:rFonts w:ascii="Times New Roman" w:hAnsi="Times New Roman" w:cs="Times New Roman"/>
+          <w:sz w:val="24"/>
+          <w:szCs w:val="24"/>
+        </w:rPr>
+        <w:t>learazas</w:t>
+      </w:r>
+      <w:proofErr w:type="spellEnd"/>
+      <w:r>
+        <w:rPr>
+          <w:rFonts w:ascii="Times New Roman" w:hAnsi="Times New Roman" w:cs="Times New Roman"/>
+          <w:sz w:val="24"/>
+          <w:szCs w:val="24"/>
+        </w:rPr>
+        <w:t xml:space="preserve"> tábla az előre definiált kedvezményértékeket tartalmazza, amelyek termékekre alkalmazhatók. A </w:t>
+      </w:r>
+      <w:proofErr w:type="spellStart"/>
+      <w:r>
+        <w:rPr>
+          <w:rFonts w:ascii="Times New Roman" w:hAnsi="Times New Roman" w:cs="Times New Roman"/>
+          <w:sz w:val="24"/>
+          <w:szCs w:val="24"/>
+        </w:rPr>
+        <w:t>LearazasMerteke</w:t>
+      </w:r>
+      <w:proofErr w:type="spellEnd"/>
+      <w:r>
+        <w:rPr>
+          <w:rFonts w:ascii="Times New Roman" w:hAnsi="Times New Roman" w:cs="Times New Roman"/>
+          <w:sz w:val="24"/>
+          <w:szCs w:val="24"/>
+        </w:rPr>
+        <w:t xml:space="preserve"> mező százalékos értékeket tartalmaz 0-tól 95%-</w:t>
+      </w:r>
+      <w:proofErr w:type="spellStart"/>
+      <w:r>
+        <w:rPr>
+          <w:rFonts w:ascii="Times New Roman" w:hAnsi="Times New Roman" w:cs="Times New Roman"/>
+          <w:sz w:val="24"/>
+          <w:szCs w:val="24"/>
+        </w:rPr>
+        <w:t>ig</w:t>
+      </w:r>
+      <w:proofErr w:type="spellEnd"/>
+      <w:r>
+        <w:rPr>
+          <w:rFonts w:ascii="Times New Roman" w:hAnsi="Times New Roman" w:cs="Times New Roman"/>
+          <w:sz w:val="24"/>
+          <w:szCs w:val="24"/>
+        </w:rPr>
+        <w:t xml:space="preserve">, 5%-os lépésekben. Ha egy termék </w:t>
+      </w:r>
+      <w:proofErr w:type="spellStart"/>
+      <w:r>
+        <w:rPr>
+          <w:rFonts w:ascii="Times New Roman" w:hAnsi="Times New Roman" w:cs="Times New Roman"/>
+          <w:sz w:val="24"/>
+          <w:szCs w:val="24"/>
+        </w:rPr>
+        <w:t>learazasid</w:t>
+      </w:r>
+      <w:proofErr w:type="spellEnd"/>
+      <w:r>
+        <w:rPr>
+          <w:rFonts w:ascii="Times New Roman" w:hAnsi="Times New Roman" w:cs="Times New Roman"/>
+          <w:sz w:val="24"/>
+          <w:szCs w:val="24"/>
+        </w:rPr>
+        <w:t xml:space="preserve"> mezője az id=1 rekordra mutat (amelynek értéke 0%), az azt jelenti, hogy a termék nincs leárazva.</w:t>
+      </w:r>
+    </w:p>
+    <w:p>
+      <w:pPr>
+        <w:rPr>
+          <w:rFonts w:ascii="Times New Roman" w:hAnsi="Times New Roman" w:cs="Times New Roman"/>
+          <w:sz w:val="24"/>
+          <w:szCs w:val="24"/>
+          <w:u w:val="single"/>
+        </w:rPr>
+      </w:pPr>
+      <w:proofErr w:type="spellStart"/>
+      <w:r>
+        <w:rPr>
+          <w:rFonts w:ascii="Times New Roman" w:hAnsi="Times New Roman" w:cs="Times New Roman"/>
+          <w:sz w:val="24"/>
+          <w:szCs w:val="24"/>
+          <w:u w:val="single"/>
+        </w:rPr>
+        <w:t>szoveg</w:t>
+      </w:r>
+      <w:proofErr w:type="spellEnd"/>
+    </w:p>
+    <w:p>
+      <w:pPr>
+        <w:rPr>
+          <w:rFonts w:ascii="Times New Roman" w:hAnsi="Times New Roman" w:cs="Times New Roman"/>
+          <w:sz w:val="24"/>
+          <w:szCs w:val="24"/>
+        </w:rPr>
+      </w:pPr>
+      <w:r>
+        <w:rPr>
+          <w:rFonts w:ascii="Times New Roman" w:hAnsi="Times New Roman" w:cs="Times New Roman"/>
+          <w:sz w:val="24"/>
+          <w:szCs w:val="24"/>
+        </w:rPr>
+        <w:t xml:space="preserve">A </w:t>
+      </w:r>
+      <w:proofErr w:type="spellStart"/>
+      <w:r>
+        <w:rPr>
+          <w:rFonts w:ascii="Times New Roman" w:hAnsi="Times New Roman" w:cs="Times New Roman"/>
+          <w:sz w:val="24"/>
+          <w:szCs w:val="24"/>
+        </w:rPr>
+        <w:t>szoveg</w:t>
+      </w:r>
+      <w:proofErr w:type="spellEnd"/>
+      <w:r>
+        <w:rPr>
+          <w:rFonts w:ascii="Times New Roman" w:hAnsi="Times New Roman" w:cs="Times New Roman"/>
+          <w:sz w:val="24"/>
+          <w:szCs w:val="24"/>
+        </w:rPr>
+        <w:t xml:space="preserve"> tábla az oldal statikus, kétnyelvű szövegeit tárolja (</w:t>
+      </w:r>
+      <w:proofErr w:type="spellStart"/>
+      <w:r>
+        <w:rPr>
+          <w:rFonts w:ascii="Times New Roman" w:hAnsi="Times New Roman" w:cs="Times New Roman"/>
+          <w:sz w:val="24"/>
+          <w:szCs w:val="24"/>
+        </w:rPr>
+        <w:t>szoveg</w:t>
+      </w:r>
+      <w:proofErr w:type="spellEnd"/>
+      <w:r>
+        <w:rPr>
+          <w:rFonts w:ascii="Times New Roman" w:hAnsi="Times New Roman" w:cs="Times New Roman"/>
+          <w:sz w:val="24"/>
+          <w:szCs w:val="24"/>
+        </w:rPr>
+        <w:t xml:space="preserve">: magyar, </w:t>
+      </w:r>
+      <w:proofErr w:type="spellStart"/>
+      <w:r>
+        <w:rPr>
+          <w:rFonts w:ascii="Times New Roman" w:hAnsi="Times New Roman" w:cs="Times New Roman"/>
+          <w:sz w:val="24"/>
+          <w:szCs w:val="24"/>
+        </w:rPr>
+        <w:t>szoveg_en</w:t>
+      </w:r>
+      <w:proofErr w:type="spellEnd"/>
+      <w:r>
+        <w:rPr>
+          <w:rFonts w:ascii="Times New Roman" w:hAnsi="Times New Roman" w:cs="Times New Roman"/>
+          <w:sz w:val="24"/>
+          <w:szCs w:val="24"/>
+        </w:rPr>
+        <w:t>: angol). Ez a megoldás lehetővé teszi, hogy az adminisztrátorok az adatbázison keresztül módosítsák az oldal szöveges tartalmait anélkül, hogy a forráskódhoz kellene nyúlniuk.</w:t>
+      </w:r>
+    </w:p>
+    <w:p>
+      <w:pPr>
+        <w:spacing w:afterLines="160" w:after="384"/>
+        <w:rPr>
+          <w:rFonts w:ascii="Times New Roman" w:hAnsi="Times New Roman" w:cs="Times New Roman"/>
+          <w:sz w:val="24"/>
+          <w:szCs w:val="24"/>
+          <w:u w:val="single"/>
+        </w:rPr>
+      </w:pPr>
+      <w:proofErr w:type="spellStart"/>
+      <w:r>
+        <w:rPr>
+          <w:rFonts w:ascii="Times New Roman" w:hAnsi="Times New Roman" w:cs="Times New Roman"/>
+          <w:sz w:val="24"/>
+          <w:szCs w:val="24"/>
+          <w:u w:val="single"/>
+        </w:rPr>
+        <w:t>jelszo_visszaallitas</w:t>
+      </w:r>
+      <w:proofErr w:type="spellEnd"/>
+    </w:p>
+    <w:p>
+      <w:pPr>
+        <w:spacing w:afterLines="160" w:after="384"/>
+        <w:rPr>
+          <w:rFonts w:ascii="Times New Roman" w:hAnsi="Times New Roman" w:cs="Times New Roman"/>
+          <w:sz w:val="24"/>
+          <w:szCs w:val="24"/>
+        </w:rPr>
+      </w:pPr>
+      <w:r>
+        <w:rPr>
+          <w:rFonts w:ascii="Times New Roman" w:hAnsi="Times New Roman" w:cs="Times New Roman"/>
+          <w:sz w:val="24"/>
+          <w:szCs w:val="24"/>
+        </w:rPr>
+        <w:t xml:space="preserve">A </w:t>
+      </w:r>
+      <w:proofErr w:type="spellStart"/>
+      <w:r>
+        <w:rPr>
+          <w:rFonts w:ascii="Times New Roman" w:hAnsi="Times New Roman" w:cs="Times New Roman"/>
+          <w:sz w:val="24"/>
+          <w:szCs w:val="24"/>
+        </w:rPr>
+        <w:t>jelszo_visszaallitas</w:t>
+      </w:r>
+      <w:proofErr w:type="spellEnd"/>
+      <w:r>
+        <w:rPr>
+          <w:rFonts w:ascii="Times New Roman" w:hAnsi="Times New Roman" w:cs="Times New Roman"/>
+          <w:sz w:val="24"/>
+          <w:szCs w:val="24"/>
+        </w:rPr>
+        <w:t xml:space="preserve"> tábla </w:t>
+      </w:r>
+      <w:r>
+        <w:rPr>
+          <w:rFonts w:ascii="Times New Roman" w:hAnsi="Times New Roman" w:cs="Times New Roman"/>
+          <w:sz w:val="24"/>
+          <w:szCs w:val="24"/>
+        </w:rPr>
+        <w:t>az</w:t>
+      </w:r>
+      <w:r>
+        <w:rPr>
+          <w:rFonts w:ascii="Times New Roman" w:hAnsi="Times New Roman" w:cs="Times New Roman"/>
+          <w:sz w:val="24"/>
+          <w:szCs w:val="24"/>
+        </w:rPr>
+        <w:t xml:space="preserve"> elfelejtett jelszó funkció működését támogatja. Amikor egy felhasználó jelszó-visszaállítást kér, a rendszer egy egyedi </w:t>
+      </w:r>
+      <w:proofErr w:type="spellStart"/>
+      <w:r>
+        <w:rPr>
+          <w:rFonts w:ascii="Times New Roman" w:hAnsi="Times New Roman" w:cs="Times New Roman"/>
+          <w:sz w:val="24"/>
+          <w:szCs w:val="24"/>
+        </w:rPr>
+        <w:t>tokent</w:t>
+      </w:r>
+      <w:proofErr w:type="spellEnd"/>
+      <w:r>
+        <w:rPr>
+          <w:rFonts w:ascii="Times New Roman" w:hAnsi="Times New Roman" w:cs="Times New Roman"/>
+          <w:sz w:val="24"/>
+          <w:szCs w:val="24"/>
+        </w:rPr>
+        <w:t xml:space="preserve"> generál, amelyet ebben a táblában tárol el az érintett e-mail címmel együtt. A </w:t>
+      </w:r>
+      <w:proofErr w:type="spellStart"/>
+      <w:r>
+        <w:rPr>
+          <w:rFonts w:ascii="Times New Roman" w:hAnsi="Times New Roman" w:cs="Times New Roman"/>
+          <w:sz w:val="24"/>
+          <w:szCs w:val="24"/>
+        </w:rPr>
+        <w:t>lejarat</w:t>
+      </w:r>
+      <w:proofErr w:type="spellEnd"/>
+      <w:r>
+        <w:rPr>
+          <w:rFonts w:ascii="Times New Roman" w:hAnsi="Times New Roman" w:cs="Times New Roman"/>
+          <w:sz w:val="24"/>
+          <w:szCs w:val="24"/>
+        </w:rPr>
+        <w:t xml:space="preserve"> mező datetime típusú, és meghatározza, hogy meddig érvényes a visszaállítási link — ezzel megakadályozva a régi </w:t>
+      </w:r>
+      <w:proofErr w:type="spellStart"/>
+      <w:r>
+        <w:rPr>
+          <w:rFonts w:ascii="Times New Roman" w:hAnsi="Times New Roman" w:cs="Times New Roman"/>
+          <w:sz w:val="24"/>
+          <w:szCs w:val="24"/>
+        </w:rPr>
+        <w:t>tokenek</w:t>
+      </w:r>
+      <w:proofErr w:type="spellEnd"/>
+      <w:r>
+        <w:rPr>
+          <w:rFonts w:ascii="Times New Roman" w:hAnsi="Times New Roman" w:cs="Times New Roman"/>
+          <w:sz w:val="24"/>
+          <w:szCs w:val="24"/>
+        </w:rPr>
+        <w:t xml:space="preserve"> visszaélésszerű felhasználását. A sikeres jelszócsere után a megfelelő sor törlődik a táblából.</w:t>
+      </w:r>
+    </w:p>
+    <w:p>
+      <w:pPr>
+        <w:spacing w:afterLines="160" w:after="384"/>
         <w:rPr>
           <w:rFonts w:ascii="Times New Roman" w:hAnsi="Times New Roman" w:cs="Times New Roman"/>
           <w:b/>
           <w:bCs/>
+          <w:sz w:val="26"/>
+          <w:szCs w:val="26"/>
+        </w:rPr>
+      </w:pPr>
+      <w:r>
+        <w:rPr>
+          <w:rFonts w:ascii="Times New Roman" w:hAnsi="Times New Roman" w:cs="Times New Roman"/>
+          <w:b/>
+          <w:bCs/>
+          <w:sz w:val="26"/>
+          <w:szCs w:val="26"/>
+        </w:rPr>
+        <w:t>Táblák közötti kapcsolatok</w:t>
+      </w:r>
+      <w:r>
+        <w:rPr>
+          <w:rFonts w:ascii="Times New Roman" w:hAnsi="Times New Roman" w:cs="Times New Roman"/>
+          <w:b/>
+          <w:bCs/>
+          <w:sz w:val="26"/>
+          <w:szCs w:val="26"/>
         </w:rPr>
         <w:t>:</w:t>
       </w:r>
     </w:p>
     <w:p>
       <w:pPr>
-        <w:pStyle w:val="Heading2"/>
+        <w:spacing w:afterLines="160" w:after="384"/>
+        <w:rPr>
+          <w:rFonts w:ascii="Times New Roman" w:hAnsi="Times New Roman" w:cs="Times New Roman"/>
+          <w:sz w:val="24"/>
+          <w:szCs w:val="24"/>
+        </w:rPr>
+      </w:pPr>
+      <w:r>
+        <w:rPr>
+          <w:rFonts w:ascii="Times New Roman" w:hAnsi="Times New Roman" w:cs="Times New Roman"/>
+          <w:sz w:val="24"/>
+          <w:szCs w:val="24"/>
+        </w:rPr>
+        <w:t xml:space="preserve">Az adatbázis kapcsolatrendszere a következőképpen épül fel. A </w:t>
+      </w:r>
+      <w:proofErr w:type="spellStart"/>
+      <w:r>
+        <w:rPr>
+          <w:rFonts w:ascii="Times New Roman" w:hAnsi="Times New Roman" w:cs="Times New Roman"/>
+          <w:sz w:val="24"/>
+          <w:szCs w:val="24"/>
+        </w:rPr>
+        <w:t>felhasznalo</w:t>
+      </w:r>
+      <w:proofErr w:type="spellEnd"/>
+      <w:r>
+        <w:rPr>
+          <w:rFonts w:ascii="Times New Roman" w:hAnsi="Times New Roman" w:cs="Times New Roman"/>
+          <w:sz w:val="24"/>
+          <w:szCs w:val="24"/>
+        </w:rPr>
+        <w:t xml:space="preserve"> tábla kapcsolódik a rang táblához (</w:t>
+      </w:r>
+      <w:proofErr w:type="spellStart"/>
+      <w:r>
+        <w:rPr>
+          <w:rFonts w:ascii="Times New Roman" w:hAnsi="Times New Roman" w:cs="Times New Roman"/>
+          <w:sz w:val="24"/>
+          <w:szCs w:val="24"/>
+        </w:rPr>
+        <w:t>rangId</w:t>
+      </w:r>
+      <w:proofErr w:type="spellEnd"/>
+      <w:r>
+        <w:rPr>
+          <w:rFonts w:ascii="Times New Roman" w:hAnsi="Times New Roman" w:cs="Times New Roman"/>
+          <w:sz w:val="24"/>
+          <w:szCs w:val="24"/>
+        </w:rPr>
+        <w:t xml:space="preserve"> idegen kulcson keresztül), a </w:t>
+      </w:r>
+      <w:proofErr w:type="spellStart"/>
+      <w:r>
+        <w:rPr>
+          <w:rFonts w:ascii="Times New Roman" w:hAnsi="Times New Roman" w:cs="Times New Roman"/>
+          <w:sz w:val="24"/>
+          <w:szCs w:val="24"/>
+        </w:rPr>
+        <w:t>szallitasicimek</w:t>
+      </w:r>
+      <w:proofErr w:type="spellEnd"/>
+      <w:r>
+        <w:rPr>
+          <w:rFonts w:ascii="Times New Roman" w:hAnsi="Times New Roman" w:cs="Times New Roman"/>
+          <w:sz w:val="24"/>
+          <w:szCs w:val="24"/>
+        </w:rPr>
+        <w:t xml:space="preserve"> táblához (egy felhasználónak több szállítási címe lehet), és a </w:t>
+      </w:r>
+      <w:proofErr w:type="spellStart"/>
+      <w:r>
+        <w:rPr>
+          <w:rFonts w:ascii="Times New Roman" w:hAnsi="Times New Roman" w:cs="Times New Roman"/>
+          <w:sz w:val="24"/>
+          <w:szCs w:val="24"/>
+        </w:rPr>
+        <w:t>rendeles</w:t>
+      </w:r>
+      <w:proofErr w:type="spellEnd"/>
+      <w:r>
+        <w:rPr>
+          <w:rFonts w:ascii="Times New Roman" w:hAnsi="Times New Roman" w:cs="Times New Roman"/>
+          <w:sz w:val="24"/>
+          <w:szCs w:val="24"/>
+        </w:rPr>
+        <w:t xml:space="preserve"> táblához (egy felhasználónak több </w:t>
+      </w:r>
+      <w:r>
+        <w:rPr>
+          <w:rFonts w:ascii="Times New Roman" w:hAnsi="Times New Roman" w:cs="Times New Roman"/>
+          <w:sz w:val="24"/>
+          <w:szCs w:val="24"/>
+        </w:rPr>
+        <w:lastRenderedPageBreak/>
+        <w:t xml:space="preserve">rendelése lehet). A </w:t>
+      </w:r>
+      <w:proofErr w:type="spellStart"/>
+      <w:r>
+        <w:rPr>
+          <w:rFonts w:ascii="Times New Roman" w:hAnsi="Times New Roman" w:cs="Times New Roman"/>
+          <w:sz w:val="24"/>
+          <w:szCs w:val="24"/>
+        </w:rPr>
+        <w:t>rendeles</w:t>
+      </w:r>
+      <w:proofErr w:type="spellEnd"/>
+      <w:r>
+        <w:rPr>
+          <w:rFonts w:ascii="Times New Roman" w:hAnsi="Times New Roman" w:cs="Times New Roman"/>
+          <w:sz w:val="24"/>
+          <w:szCs w:val="24"/>
+        </w:rPr>
+        <w:t xml:space="preserve"> tábla kapcsolódik a </w:t>
+      </w:r>
+      <w:proofErr w:type="spellStart"/>
+      <w:r>
+        <w:rPr>
+          <w:rFonts w:ascii="Times New Roman" w:hAnsi="Times New Roman" w:cs="Times New Roman"/>
+          <w:sz w:val="24"/>
+          <w:szCs w:val="24"/>
+        </w:rPr>
+        <w:t>szallitasicimek</w:t>
+      </w:r>
+      <w:proofErr w:type="spellEnd"/>
+      <w:r>
+        <w:rPr>
+          <w:rFonts w:ascii="Times New Roman" w:hAnsi="Times New Roman" w:cs="Times New Roman"/>
+          <w:sz w:val="24"/>
+          <w:szCs w:val="24"/>
+        </w:rPr>
+        <w:t xml:space="preserve"> táblához (</w:t>
+      </w:r>
+      <w:proofErr w:type="spellStart"/>
+      <w:r>
+        <w:rPr>
+          <w:rFonts w:ascii="Times New Roman" w:hAnsi="Times New Roman" w:cs="Times New Roman"/>
+          <w:sz w:val="24"/>
+          <w:szCs w:val="24"/>
+        </w:rPr>
+        <w:t>szallitasId</w:t>
+      </w:r>
+      <w:proofErr w:type="spellEnd"/>
+      <w:r>
+        <w:rPr>
+          <w:rFonts w:ascii="Times New Roman" w:hAnsi="Times New Roman" w:cs="Times New Roman"/>
+          <w:sz w:val="24"/>
+          <w:szCs w:val="24"/>
+        </w:rPr>
+        <w:t xml:space="preserve"> idegen kulcson), és a </w:t>
+      </w:r>
+      <w:proofErr w:type="spellStart"/>
+      <w:r>
+        <w:rPr>
+          <w:rFonts w:ascii="Times New Roman" w:hAnsi="Times New Roman" w:cs="Times New Roman"/>
+          <w:sz w:val="24"/>
+          <w:szCs w:val="24"/>
+        </w:rPr>
+        <w:t>tetelek</w:t>
+      </w:r>
+      <w:proofErr w:type="spellEnd"/>
+      <w:r>
+        <w:rPr>
+          <w:rFonts w:ascii="Times New Roman" w:hAnsi="Times New Roman" w:cs="Times New Roman"/>
+          <w:sz w:val="24"/>
+          <w:szCs w:val="24"/>
+        </w:rPr>
+        <w:t xml:space="preserve"> táblán keresztül a termek táblához. A termek tábla kapcsolódik a </w:t>
+      </w:r>
+      <w:proofErr w:type="spellStart"/>
+      <w:r>
+        <w:rPr>
+          <w:rFonts w:ascii="Times New Roman" w:hAnsi="Times New Roman" w:cs="Times New Roman"/>
+          <w:sz w:val="24"/>
+          <w:szCs w:val="24"/>
+        </w:rPr>
+        <w:t>kategoria</w:t>
+      </w:r>
+      <w:proofErr w:type="spellEnd"/>
+      <w:r>
+        <w:rPr>
+          <w:rFonts w:ascii="Times New Roman" w:hAnsi="Times New Roman" w:cs="Times New Roman"/>
+          <w:sz w:val="24"/>
+          <w:szCs w:val="24"/>
+        </w:rPr>
+        <w:t xml:space="preserve"> táblához (</w:t>
+      </w:r>
+      <w:proofErr w:type="spellStart"/>
+      <w:r>
+        <w:rPr>
+          <w:rFonts w:ascii="Times New Roman" w:hAnsi="Times New Roman" w:cs="Times New Roman"/>
+          <w:sz w:val="24"/>
+          <w:szCs w:val="24"/>
+        </w:rPr>
+        <w:t>kategoriaId</w:t>
+      </w:r>
+      <w:proofErr w:type="spellEnd"/>
+      <w:r>
+        <w:rPr>
+          <w:rFonts w:ascii="Times New Roman" w:hAnsi="Times New Roman" w:cs="Times New Roman"/>
+          <w:sz w:val="24"/>
+          <w:szCs w:val="24"/>
+        </w:rPr>
+        <w:t xml:space="preserve">) és a </w:t>
+      </w:r>
+      <w:proofErr w:type="spellStart"/>
+      <w:r>
+        <w:rPr>
+          <w:rFonts w:ascii="Times New Roman" w:hAnsi="Times New Roman" w:cs="Times New Roman"/>
+          <w:sz w:val="24"/>
+          <w:szCs w:val="24"/>
+        </w:rPr>
+        <w:t>learazas</w:t>
+      </w:r>
+      <w:proofErr w:type="spellEnd"/>
+      <w:r>
+        <w:rPr>
+          <w:rFonts w:ascii="Times New Roman" w:hAnsi="Times New Roman" w:cs="Times New Roman"/>
+          <w:sz w:val="24"/>
+          <w:szCs w:val="24"/>
+        </w:rPr>
+        <w:t xml:space="preserve"> táblához (</w:t>
+      </w:r>
+      <w:proofErr w:type="spellStart"/>
+      <w:r>
+        <w:rPr>
+          <w:rFonts w:ascii="Times New Roman" w:hAnsi="Times New Roman" w:cs="Times New Roman"/>
+          <w:sz w:val="24"/>
+          <w:szCs w:val="24"/>
+        </w:rPr>
+        <w:t>learazasid</w:t>
+      </w:r>
+      <w:proofErr w:type="spellEnd"/>
+      <w:r>
+        <w:rPr>
+          <w:rFonts w:ascii="Times New Roman" w:hAnsi="Times New Roman" w:cs="Times New Roman"/>
+          <w:sz w:val="24"/>
+          <w:szCs w:val="24"/>
+        </w:rPr>
+        <w:t xml:space="preserve">). A </w:t>
+      </w:r>
+      <w:proofErr w:type="spellStart"/>
+      <w:r>
+        <w:rPr>
+          <w:rFonts w:ascii="Times New Roman" w:hAnsi="Times New Roman" w:cs="Times New Roman"/>
+          <w:sz w:val="24"/>
+          <w:szCs w:val="24"/>
+        </w:rPr>
+        <w:t>jelszo_visszaallitas</w:t>
+      </w:r>
+      <w:proofErr w:type="spellEnd"/>
+      <w:r>
+        <w:rPr>
+          <w:rFonts w:ascii="Times New Roman" w:hAnsi="Times New Roman" w:cs="Times New Roman"/>
+          <w:sz w:val="24"/>
+          <w:szCs w:val="24"/>
+        </w:rPr>
+        <w:t xml:space="preserve"> tábla önállóan működik: a felhasználó e-mail címén keresztül közvetve kapcsolódik a </w:t>
+      </w:r>
+      <w:proofErr w:type="spellStart"/>
+      <w:r>
+        <w:rPr>
+          <w:rFonts w:ascii="Times New Roman" w:hAnsi="Times New Roman" w:cs="Times New Roman"/>
+          <w:sz w:val="24"/>
+          <w:szCs w:val="24"/>
+        </w:rPr>
+        <w:t>felhasznalo</w:t>
+      </w:r>
+      <w:proofErr w:type="spellEnd"/>
+      <w:r>
+        <w:rPr>
+          <w:rFonts w:ascii="Times New Roman" w:hAnsi="Times New Roman" w:cs="Times New Roman"/>
+          <w:sz w:val="24"/>
+          <w:szCs w:val="24"/>
+        </w:rPr>
+        <w:t xml:space="preserve"> táblához, de közvetlen idegen kulcs kapcsolat nincs köztük. A fenti kapcsolatok normalizált, 3NF-nek megfelelő adatbázisszerkezetet alkotnak, amelyben az adatredundancia minimálisra csökkentett.</w:t>
+      </w:r>
+    </w:p>
+    <w:p>
+      <w:pPr>
+        <w:pStyle w:val="Cmsor1"/>
+        <w:rPr>
+          <w:rFonts w:ascii="Times New Roman" w:hAnsi="Times New Roman" w:cs="Times New Roman"/>
+          <w:b/>
+          <w:bCs/>
+        </w:rPr>
+      </w:pPr>
+      <w:r>
+        <w:rPr>
+          <w:rFonts w:ascii="Times New Roman" w:hAnsi="Times New Roman" w:cs="Times New Roman"/>
+          <w:b/>
+          <w:bCs/>
+        </w:rPr>
+        <w:t>Részletes feladatspecifikáció</w:t>
+      </w:r>
+      <w:r>
+        <w:rPr>
+          <w:rFonts w:ascii="Times New Roman" w:hAnsi="Times New Roman" w:cs="Times New Roman"/>
+          <w:b/>
+          <w:bCs/>
+        </w:rPr>
+        <w:t>:</w:t>
+      </w:r>
+    </w:p>
+    <w:p>
+      <w:pPr>
+        <w:pStyle w:val="Cmsor2"/>
       </w:pPr>
       <w:r>
         <w:t>A bejelentkezés működése</w:t>
@@ -1013,7 +2839,7 @@
                     <pic:cNvPicPr/>
                   </pic:nvPicPr>
                   <pic:blipFill>
-                    <a:blip r:embed="rId6"/>
+                    <a:blip r:embed="rId7"/>
                     <a:stretch>
                       <a:fillRect/>
                     </a:stretch>
@@ -1068,7 +2894,7 @@
                     <pic:cNvPicPr/>
                   </pic:nvPicPr>
                   <pic:blipFill>
-                    <a:blip r:embed="rId7"/>
+                    <a:blip r:embed="rId8"/>
                     <a:stretch>
                       <a:fillRect/>
                     </a:stretch>
@@ -1103,7 +2929,23 @@
           <w:sz w:val="24"/>
           <w:szCs w:val="24"/>
         </w:rPr>
-        <w:t>Először megnézzük, hogy a captcha helyesen lett megoldva, ha nem akkor megnézi milyen nyelv van beállítva és annak megfelelően ír ki hiba üzenetet, majd újabb captchát generál. Következő lépésként elküld PUT kérést „/backend/</w:t>
+        <w:t>Először megnézzük, hogy a captcha helyesen lett megoldva, ha nem akkor megnézi milyen nyelv van beállítva és annak megfelelően ír ki hiba üzenetet, majd újabb captchát generál. Következő lépésként elküld</w:t>
+      </w:r>
+      <w:r>
+        <w:rPr>
+          <w:rFonts w:ascii="Times New Roman" w:hAnsi="Times New Roman" w:cs="Times New Roman"/>
+          <w:sz w:val="24"/>
+          <w:szCs w:val="24"/>
+        </w:rPr>
+        <w:t xml:space="preserve"> egy</w:t>
+      </w:r>
+      <w:r>
+        <w:rPr>
+          <w:rFonts w:ascii="Times New Roman" w:hAnsi="Times New Roman" w:cs="Times New Roman"/>
+          <w:sz w:val="24"/>
+          <w:szCs w:val="24"/>
+        </w:rPr>
+        <w:t xml:space="preserve"> PUT kérést „/backend/</w:t>
       </w:r>
       <w:proofErr w:type="spellStart"/>
       <w:r>
@@ -1193,6 +3035,14 @@
         </w:rPr>
         <w:lastRenderedPageBreak/>
         <w:t>a nyelvet, majd kiírja azon hiba kódot</w:t>
+      </w:r>
+      <w:r>
+        <w:rPr>
+          <w:rFonts w:ascii="Times New Roman" w:hAnsi="Times New Roman" w:cs="Times New Roman"/>
+          <w:sz w:val="24"/>
+          <w:szCs w:val="24"/>
+        </w:rPr>
+        <w:t>.</w:t>
       </w:r>
       <w:r>
         <w:rPr>
@@ -1214,7 +3064,7 @@
                     <pic:cNvPicPr/>
                   </pic:nvPicPr>
                   <pic:blipFill>
-                    <a:blip r:embed="rId8"/>
+                    <a:blip r:embed="rId9"/>
                     <a:stretch>
                       <a:fillRect/>
                     </a:stretch>
@@ -1245,7 +3095,7 @@
     </w:p>
     <w:p>
       <w:pPr>
-        <w:pStyle w:val="Heading2"/>
+        <w:pStyle w:val="Cmsor2"/>
       </w:pPr>
       <w:r>
         <w:lastRenderedPageBreak/>
@@ -1273,7 +3123,7 @@
                     <pic:cNvPicPr/>
                   </pic:nvPicPr>
                   <pic:blipFill>
-                    <a:blip r:embed="rId9">
+                    <a:blip r:embed="rId10">
                       <a:extLst>
                         <a:ext uri="{28A0092B-C50C-407E-A947-70E740481C1C}">
                           <a14:useLocalDpi xmlns:a14="http://schemas.microsoft.com/office/drawing/2010/main" val="0"/>
@@ -1310,15 +3160,7 @@
       </w:r>
       <w:proofErr w:type="spellEnd"/>
       <w:r>
-        <w:t>-</w:t>
-      </w:r>
-      <w:proofErr w:type="spellStart"/>
-      <w:r>
-        <w:t>id</w:t>
-      </w:r>
-      <w:proofErr w:type="spellEnd"/>
-      <w:r>
-        <w:t>-ban. Rányomáskor lefuttatja a „</w:t>
+        <w:t>-id-ban. Rányomáskor lefuttatja a „</w:t>
       </w:r>
       <w:proofErr w:type="spellStart"/>
       <w:r>
@@ -1350,7 +3192,7 @@
                     <pic:cNvPicPr/>
                   </pic:nvPicPr>
                   <pic:blipFill>
-                    <a:blip r:embed="rId10"/>
+                    <a:blip r:embed="rId11"/>
                     <a:stretch>
                       <a:fillRect/>
                     </a:stretch>
@@ -1425,7 +3267,7 @@
                     <pic:cNvPicPr/>
                   </pic:nvPicPr>
                   <pic:blipFill>
-                    <a:blip r:embed="rId11"/>
+                    <a:blip r:embed="rId12"/>
                     <a:stretch>
                       <a:fillRect/>
                     </a:stretch>
@@ -1448,7 +3290,13 @@
     </w:p>
     <w:p>
       <w:r>
-        <w:t>A végpont először megnéz</w:t>
+        <w:t>A végpont</w:t>
+      </w:r>
+      <w:r>
+        <w:t>on</w:t>
+      </w:r>
+      <w:r>
+        <w:t xml:space="preserve"> először megnéz</w:t>
       </w:r>
       <w:r>
         <w:t>zük</w:t>
@@ -1457,7 +3305,19 @@
         <w:t>, hogy be van</w:t>
       </w:r>
       <w:r>
-        <w:t>-e jelentkezve a felhasználó, majd lekérjük a felhasználó kosarát, és megnézzük, hogy tartalmazza a kívánt terméket. Ha nem akkor hozzáad, ha igen akkor annak terméknek a mennyiségét növeli eggyel.</w:t>
+        <w:t>-e jelentkezve a felhasználó, majd lekérjük a felhasználó kosarát, és megnézzük, hogy tartalmazza</w:t>
+      </w:r>
+      <w:r>
+        <w:t>-e</w:t>
+      </w:r>
+      <w:r>
+        <w:t xml:space="preserve"> a kívánt terméket. Ha nem akkor hozzáad, ha igen akkor annak </w:t>
+      </w:r>
+      <w:r>
+        <w:t xml:space="preserve">a </w:t>
+      </w:r>
+      <w:r>
+        <w:t>terméknek a mennyiségét növeli eggyel.</w:t>
       </w:r>
     </w:p>
     <w:sectPr>
@@ -1986,16 +3846,16 @@
     <w:lsdException w:name="Unresolved Mention" w:semiHidden="1" w:unhideWhenUsed="1"/>
     <w:lsdException w:name="Smart Link" w:semiHidden="1" w:unhideWhenUsed="1"/>
   </w:latentStyles>
-  <w:style w:type="paragraph" w:default="1" w:styleId="Normal">
+  <w:style w:type="paragraph" w:default="1" w:styleId="Norml">
     <w:name w:val="Normal"/>
     <w:qFormat/>
     <w:rsid w:val="00BA3AA0"/>
   </w:style>
-  <w:style w:type="paragraph" w:styleId="Heading1">
+  <w:style w:type="paragraph" w:styleId="Cmsor1">
     <w:name w:val="heading 1"/>
-    <w:basedOn w:val="Normal"/>
-    <w:next w:val="Normal"/>
-    <w:link w:val="Heading1Char"/>
+    <w:basedOn w:val="Norml"/>
+    <w:next w:val="Norml"/>
+    <w:link w:val="Cmsor1Char"/>
     <w:uiPriority w:val="9"/>
     <w:qFormat/>
     <w:rsid w:val="00402772"/>
@@ -2011,11 +3871,11 @@
       <w:szCs w:val="32"/>
     </w:rPr>
   </w:style>
-  <w:style w:type="paragraph" w:styleId="Heading2">
+  <w:style w:type="paragraph" w:styleId="Cmsor2">
     <w:name w:val="heading 2"/>
-    <w:basedOn w:val="Normal"/>
-    <w:next w:val="Normal"/>
-    <w:link w:val="Heading2Char"/>
+    <w:basedOn w:val="Norml"/>
+    <w:next w:val="Norml"/>
+    <w:link w:val="Cmsor2Char"/>
     <w:uiPriority w:val="9"/>
     <w:unhideWhenUsed/>
     <w:qFormat/>
@@ -2032,13 +3892,12 @@
       <w:szCs w:val="26"/>
     </w:rPr>
   </w:style>
-  <w:style w:type="character" w:default="1" w:styleId="DefaultParagraphFont">
+  <w:style w:type="character" w:default="1" w:styleId="Bekezdsalapbettpusa">
     <w:name w:val="Default Paragraph Font"/>
     <w:uiPriority w:val="1"/>
-    <w:semiHidden/>
     <w:unhideWhenUsed/>
   </w:style>
-  <w:style w:type="table" w:default="1" w:styleId="TableNormal">
+  <w:style w:type="table" w:default="1" w:styleId="Normltblzat">
     <w:name w:val="Normal Table"/>
     <w:uiPriority w:val="99"/>
     <w:semiHidden/>
@@ -2053,15 +3912,15 @@
       </w:tblCellMar>
     </w:tblPr>
   </w:style>
-  <w:style w:type="numbering" w:default="1" w:styleId="NoList">
+  <w:style w:type="numbering" w:default="1" w:styleId="Nemlista">
     <w:name w:val="No List"/>
     <w:uiPriority w:val="99"/>
     <w:semiHidden/>
     <w:unhideWhenUsed/>
   </w:style>
-  <w:style w:type="paragraph" w:styleId="NormalWeb">
+  <w:style w:type="paragraph" w:styleId="NormlWeb">
     <w:name w:val="Normal (Web)"/>
-    <w:basedOn w:val="Normal"/>
+    <w:basedOn w:val="Norml"/>
     <w:uiPriority w:val="99"/>
     <w:unhideWhenUsed/>
     <w:rsid w:val="002C7D0F"/>
@@ -2077,12 +3936,12 @@
   </w:style>
   <w:style w:type="character" w:customStyle="1" w:styleId="whitespace-normal">
     <w:name w:val="whitespace-normal"/>
-    <w:basedOn w:val="DefaultParagraphFont"/>
+    <w:basedOn w:val="Bekezdsalapbettpusa"/>
     <w:rsid w:val="002C7D0F"/>
   </w:style>
-  <w:style w:type="paragraph" w:styleId="ListParagraph">
+  <w:style w:type="paragraph" w:styleId="Listaszerbekezds">
     <w:name w:val="List Paragraph"/>
-    <w:basedOn w:val="Normal"/>
+    <w:basedOn w:val="Norml"/>
     <w:uiPriority w:val="34"/>
     <w:qFormat/>
     <w:rsid w:val="004F090F"/>
@@ -2091,9 +3950,9 @@
       <w:contextualSpacing/>
     </w:pPr>
   </w:style>
-  <w:style w:type="character" w:styleId="Hyperlink">
+  <w:style w:type="character" w:styleId="Hiperhivatkozs">
     <w:name w:val="Hyperlink"/>
-    <w:basedOn w:val="DefaultParagraphFont"/>
+    <w:basedOn w:val="Bekezdsalapbettpusa"/>
     <w:uiPriority w:val="99"/>
     <w:semiHidden/>
     <w:unhideWhenUsed/>
@@ -2103,10 +3962,10 @@
       <w:u w:val="single"/>
     </w:rPr>
   </w:style>
-  <w:style w:type="character" w:customStyle="1" w:styleId="Heading1Char">
-    <w:name w:val="Heading 1 Char"/>
-    <w:basedOn w:val="DefaultParagraphFont"/>
-    <w:link w:val="Heading1"/>
+  <w:style w:type="character" w:customStyle="1" w:styleId="Cmsor1Char">
+    <w:name w:val="Címsor 1 Char"/>
+    <w:basedOn w:val="Bekezdsalapbettpusa"/>
+    <w:link w:val="Cmsor1"/>
     <w:uiPriority w:val="9"/>
     <w:rsid w:val="00402772"/>
     <w:rPr>
@@ -2115,10 +3974,10 @@
       <w:szCs w:val="32"/>
     </w:rPr>
   </w:style>
-  <w:style w:type="character" w:customStyle="1" w:styleId="Heading2Char">
-    <w:name w:val="Heading 2 Char"/>
-    <w:basedOn w:val="DefaultParagraphFont"/>
-    <w:link w:val="Heading2"/>
+  <w:style w:type="character" w:customStyle="1" w:styleId="Cmsor2Char">
+    <w:name w:val="Címsor 2 Char"/>
+    <w:basedOn w:val="Bekezdsalapbettpusa"/>
+    <w:link w:val="Cmsor2"/>
     <w:uiPriority w:val="9"/>
     <w:rsid w:val="001969A1"/>
     <w:rPr>

</xml_diff>

<commit_message>
Backend tesztek dokumentalasa + tovabbfejlesztesi lehetosegek dokumentalasa + helyesirasi hibak javitasa
</commit_message>
<xml_diff>
--- a/Fejlesztői_Dokumentáció.docx
+++ b/Fejlesztői_Dokumentáció.docx
@@ -478,7 +478,7 @@
     </w:p>
     <w:p>
       <w:pPr>
-        <w:pStyle w:val="Heading1"/>
+        <w:pStyle w:val="Cmsor1"/>
         <w:rPr>
           <w:rFonts w:ascii="Times New Roman" w:hAnsi="Times New Roman" w:cs="Times New Roman"/>
           <w:b/>
@@ -651,7 +651,7 @@
     </w:p>
     <w:p>
       <w:pPr>
-        <w:pStyle w:val="NormalWeb"/>
+        <w:pStyle w:val="NormlWeb"/>
       </w:pPr>
       <w:r>
         <w:t>Összességében azért választottuk ezt a témát, mert komplex feladatként jól bemutatja a tudásunkat, miközben egy kézzelfogható, saját készítésű eredményt hoztunk létre</w:t>
@@ -665,7 +665,7 @@
     </w:p>
     <w:p>
       <w:pPr>
-        <w:pStyle w:val="Heading1"/>
+        <w:pStyle w:val="Cmsor1"/>
         <w:rPr>
           <w:rFonts w:ascii="Times New Roman" w:hAnsi="Times New Roman" w:cs="Times New Roman"/>
           <w:b/>
@@ -683,7 +683,7 @@
     </w:p>
     <w:p>
       <w:pPr>
-        <w:pStyle w:val="ListParagraph"/>
+        <w:pStyle w:val="Listaszerbekezds"/>
         <w:numPr>
           <w:ilvl w:val="0"/>
           <w:numId w:val="1"/>
@@ -705,7 +705,7 @@
     </w:p>
     <w:p>
       <w:pPr>
-        <w:pStyle w:val="ListParagraph"/>
+        <w:pStyle w:val="Listaszerbekezds"/>
         <w:numPr>
           <w:ilvl w:val="0"/>
           <w:numId w:val="1"/>
@@ -727,7 +727,7 @@
     </w:p>
     <w:p>
       <w:pPr>
-        <w:pStyle w:val="ListParagraph"/>
+        <w:pStyle w:val="Listaszerbekezds"/>
         <w:numPr>
           <w:ilvl w:val="0"/>
           <w:numId w:val="1"/>
@@ -749,7 +749,7 @@
     </w:p>
     <w:p>
       <w:pPr>
-        <w:pStyle w:val="ListParagraph"/>
+        <w:pStyle w:val="Listaszerbekezds"/>
         <w:numPr>
           <w:ilvl w:val="0"/>
           <w:numId w:val="1"/>
@@ -771,7 +771,7 @@
     </w:p>
     <w:p>
       <w:pPr>
-        <w:pStyle w:val="ListParagraph"/>
+        <w:pStyle w:val="Listaszerbekezds"/>
         <w:numPr>
           <w:ilvl w:val="0"/>
           <w:numId w:val="1"/>
@@ -793,7 +793,7 @@
     </w:p>
     <w:p>
       <w:pPr>
-        <w:pStyle w:val="ListParagraph"/>
+        <w:pStyle w:val="Listaszerbekezds"/>
         <w:numPr>
           <w:ilvl w:val="0"/>
           <w:numId w:val="1"/>
@@ -815,7 +815,7 @@
     </w:p>
     <w:p>
       <w:pPr>
-        <w:pStyle w:val="ListParagraph"/>
+        <w:pStyle w:val="Listaszerbekezds"/>
         <w:numPr>
           <w:ilvl w:val="0"/>
           <w:numId w:val="1"/>
@@ -837,7 +837,7 @@
     </w:p>
     <w:p>
       <w:pPr>
-        <w:pStyle w:val="ListParagraph"/>
+        <w:pStyle w:val="Listaszerbekezds"/>
         <w:numPr>
           <w:ilvl w:val="0"/>
           <w:numId w:val="1"/>
@@ -859,7 +859,7 @@
     </w:p>
     <w:p>
       <w:pPr>
-        <w:pStyle w:val="ListParagraph"/>
+        <w:pStyle w:val="Listaszerbekezds"/>
         <w:numPr>
           <w:ilvl w:val="0"/>
           <w:numId w:val="1"/>
@@ -881,7 +881,7 @@
     </w:p>
     <w:p>
       <w:pPr>
-        <w:pStyle w:val="ListParagraph"/>
+        <w:pStyle w:val="Listaszerbekezds"/>
         <w:numPr>
           <w:ilvl w:val="0"/>
           <w:numId w:val="1"/>
@@ -903,7 +903,7 @@
     </w:p>
     <w:p>
       <w:pPr>
-        <w:pStyle w:val="ListParagraph"/>
+        <w:pStyle w:val="Listaszerbekezds"/>
         <w:numPr>
           <w:ilvl w:val="0"/>
           <w:numId w:val="1"/>
@@ -925,7 +925,7 @@
     </w:p>
     <w:p>
       <w:pPr>
-        <w:pStyle w:val="ListParagraph"/>
+        <w:pStyle w:val="Listaszerbekezds"/>
         <w:numPr>
           <w:ilvl w:val="0"/>
           <w:numId w:val="1"/>
@@ -947,7 +947,7 @@
     </w:p>
     <w:p>
       <w:pPr>
-        <w:pStyle w:val="ListParagraph"/>
+        <w:pStyle w:val="Listaszerbekezds"/>
         <w:numPr>
           <w:ilvl w:val="0"/>
           <w:numId w:val="1"/>
@@ -977,7 +977,7 @@
       <w:hyperlink r:id="rId5" w:history="1">
         <w:r>
           <w:rPr>
-            <w:rStyle w:val="Hyperlink"/>
+            <w:rStyle w:val="Hiperhivatkozs"/>
             <w:rFonts w:ascii="Segoe UI" w:hAnsi="Segoe UI" w:cs="Segoe UI"/>
             <w:color w:val="0969DA"/>
             <w:shd w:val="clear" w:color="auto" w:fill="FFFFFF"/>
@@ -991,7 +991,7 @@
     </w:p>
     <w:p>
       <w:pPr>
-        <w:pStyle w:val="Heading1"/>
+        <w:pStyle w:val="Cmsor1"/>
         <w:rPr>
           <w:rFonts w:ascii="Times New Roman" w:hAnsi="Times New Roman" w:cs="Times New Roman"/>
           <w:b/>
@@ -1047,7 +1047,7 @@
         </w:rPr>
         <w:lastRenderedPageBreak/>
         <w:drawing>
-          <wp:anchor distT="0" distB="0" distL="114300" distR="114300" simplePos="0" relativeHeight="251660288" behindDoc="0" locked="0" layoutInCell="1" allowOverlap="1" wp14:anchorId="4B11E9E6" wp14:editId="116AC1CE">
+          <wp:anchor distT="0" distB="0" distL="114300" distR="114300" simplePos="0" relativeHeight="251660288" behindDoc="0" locked="0" layoutInCell="1" allowOverlap="1" wp14:anchorId="4B11E9E6" wp14:editId="725D8AE6">
             <wp:simplePos x="0" y="0"/>
             <wp:positionH relativeFrom="margin">
               <wp:align>right</wp:align>
@@ -1727,7 +1727,7 @@
     </w:p>
     <w:p>
       <w:pPr>
-        <w:pStyle w:val="Heading1"/>
+        <w:pStyle w:val="Cmsor1"/>
         <w:rPr>
           <w:rFonts w:ascii="Times New Roman" w:hAnsi="Times New Roman" w:cs="Times New Roman"/>
           <w:b/>
@@ -1753,7 +1753,7 @@
     </w:p>
     <w:p>
       <w:pPr>
-        <w:pStyle w:val="Heading2"/>
+        <w:pStyle w:val="Cmsor2"/>
       </w:pPr>
       <w:r>
         <w:t>A bejelentkezés működése</w:t>
@@ -1976,7 +1976,7 @@
     </w:p>
     <w:p>
       <w:pPr>
-        <w:pStyle w:val="Heading2"/>
+        <w:pStyle w:val="Cmsor2"/>
       </w:pPr>
       <w:r>
         <w:lastRenderedPageBreak/>
@@ -2166,7 +2166,7 @@
     </w:p>
     <w:p>
       <w:pPr>
-        <w:pStyle w:val="Heading1"/>
+        <w:pStyle w:val="Cmsor1"/>
         <w:rPr>
           <w:rFonts w:ascii="Times New Roman" w:hAnsi="Times New Roman" w:cs="Times New Roman"/>
         </w:rPr>
@@ -2180,7 +2180,7 @@
     </w:p>
     <w:p>
       <w:pPr>
-        <w:pStyle w:val="Heading2"/>
+        <w:pStyle w:val="Cmsor2"/>
         <w:rPr>
           <w:rFonts w:ascii="Times New Roman" w:hAnsi="Times New Roman" w:cs="Times New Roman"/>
         </w:rPr>
@@ -2211,7 +2211,7 @@
     </w:p>
     <w:p>
       <w:pPr>
-        <w:pStyle w:val="Heading2"/>
+        <w:pStyle w:val="Cmsor2"/>
         <w:rPr>
           <w:rFonts w:ascii="Times New Roman" w:hAnsi="Times New Roman" w:cs="Times New Roman"/>
         </w:rPr>
@@ -2237,15 +2237,7 @@
           <w:sz w:val="24"/>
           <w:szCs w:val="24"/>
         </w:rPr>
-        <w:t xml:space="preserve">A backend tesztek Postman </w:t>
-      </w:r>
-      <w:r>
-        <w:rPr>
-          <w:rFonts w:ascii="Times New Roman" w:hAnsi="Times New Roman" w:cs="Times New Roman"/>
-          <w:sz w:val="24"/>
-          <w:szCs w:val="24"/>
-        </w:rPr>
-        <w:t>segítségével lettek elkészítve.</w:t>
+        <w:t>A backend tesztek Postman segítségével lettek elkészítve.</w:t>
       </w:r>
     </w:p>
     <w:p>
@@ -2365,7 +2357,7 @@
     </w:p>
     <w:p>
       <w:pPr>
-        <w:pStyle w:val="ListParagraph"/>
+        <w:pStyle w:val="Listaszerbekezds"/>
         <w:numPr>
           <w:ilvl w:val="0"/>
           <w:numId w:val="2"/>
@@ -2387,7 +2379,7 @@
     </w:p>
     <w:p>
       <w:pPr>
-        <w:pStyle w:val="ListParagraph"/>
+        <w:pStyle w:val="Listaszerbekezds"/>
         <w:numPr>
           <w:ilvl w:val="0"/>
           <w:numId w:val="2"/>
@@ -2409,7 +2401,7 @@
     </w:p>
     <w:p>
       <w:pPr>
-        <w:pStyle w:val="ListParagraph"/>
+        <w:pStyle w:val="Listaszerbekezds"/>
         <w:numPr>
           <w:ilvl w:val="0"/>
           <w:numId w:val="2"/>
@@ -2431,7 +2423,7 @@
     </w:p>
     <w:p>
       <w:pPr>
-        <w:pStyle w:val="ListParagraph"/>
+        <w:pStyle w:val="Listaszerbekezds"/>
         <w:numPr>
           <w:ilvl w:val="0"/>
           <w:numId w:val="2"/>
@@ -2453,7 +2445,398 @@
     </w:p>
     <w:p>
       <w:pPr>
-        <w:pStyle w:val="Heading1"/>
+        <w:rPr>
+          <w:rFonts w:ascii="Times New Roman" w:hAnsi="Times New Roman" w:cs="Times New Roman"/>
+          <w:sz w:val="28"/>
+          <w:szCs w:val="28"/>
+          <w:u w:val="single"/>
+        </w:rPr>
+      </w:pPr>
+      <w:r>
+        <w:rPr>
+          <w:rFonts w:ascii="Times New Roman" w:hAnsi="Times New Roman" w:cs="Times New Roman"/>
+          <w:sz w:val="28"/>
+          <w:szCs w:val="28"/>
+          <w:u w:val="single"/>
+        </w:rPr>
+        <w:t>Felhasználóadat:</w:t>
+      </w:r>
+    </w:p>
+    <w:p>
+      <w:pPr>
+        <w:rPr>
+          <w:rFonts w:ascii="Times New Roman" w:hAnsi="Times New Roman" w:cs="Times New Roman"/>
+          <w:sz w:val="28"/>
+          <w:szCs w:val="28"/>
+        </w:rPr>
+      </w:pPr>
+      <w:r>
+        <w:rPr>
+          <w:rFonts w:ascii="Times New Roman" w:hAnsi="Times New Roman" w:cs="Times New Roman"/>
+          <w:sz w:val="24"/>
+          <w:szCs w:val="24"/>
+        </w:rPr>
+        <w:drawing>
+          <wp:anchor distT="0" distB="0" distL="114300" distR="114300" simplePos="0" relativeHeight="251661312" behindDoc="0" locked="0" layoutInCell="1" allowOverlap="1" wp14:anchorId="4954337D" wp14:editId="075677AA">
+            <wp:simplePos x="0" y="0"/>
+            <wp:positionH relativeFrom="column">
+              <wp:posOffset>-635</wp:posOffset>
+            </wp:positionH>
+            <wp:positionV relativeFrom="paragraph">
+              <wp:posOffset>1270</wp:posOffset>
+            </wp:positionV>
+            <wp:extent cx="5760720" cy="2401570"/>
+            <wp:effectExtent l="0" t="0" r="0" b="0"/>
+            <wp:wrapSquare wrapText="bothSides"/>
+            <wp:docPr id="1927040948" name="Kép 1"/>
+            <wp:cNvGraphicFramePr>
+              <a:graphicFrameLocks xmlns:a="http://schemas.openxmlformats.org/drawingml/2006/main" noChangeAspect="1"/>
+            </wp:cNvGraphicFramePr>
+            <a:graphic xmlns:a="http://schemas.openxmlformats.org/drawingml/2006/main">
+              <a:graphicData uri="http://schemas.openxmlformats.org/drawingml/2006/picture">
+                <pic:pic xmlns:pic="http://schemas.openxmlformats.org/drawingml/2006/picture">
+                  <pic:nvPicPr>
+                    <pic:cNvPr id="1927040948" name=""/>
+                    <pic:cNvPicPr/>
+                  </pic:nvPicPr>
+                  <pic:blipFill>
+                    <a:blip r:embed="rId14">
+                      <a:extLst>
+                        <a:ext uri="{28A0092B-C50C-407E-A947-70E740481C1C}">
+                          <a14:useLocalDpi xmlns:a14="http://schemas.microsoft.com/office/drawing/2010/main" val="0"/>
+                        </a:ext>
+                      </a:extLst>
+                    </a:blip>
+                    <a:stretch>
+                      <a:fillRect/>
+                    </a:stretch>
+                  </pic:blipFill>
+                  <pic:spPr>
+                    <a:xfrm>
+                      <a:off x="0" y="0"/>
+                      <a:ext cx="5760720" cy="2401570"/>
+                    </a:xfrm>
+                    <a:prstGeom prst="rect">
+                      <a:avLst/>
+                    </a:prstGeom>
+                  </pic:spPr>
+                </pic:pic>
+              </a:graphicData>
+            </a:graphic>
+          </wp:anchor>
+        </w:drawing>
+      </w:r>
+      <w:r>
+        <w:rPr>
+          <w:rFonts w:ascii="Times New Roman" w:hAnsi="Times New Roman" w:cs="Times New Roman"/>
+          <w:sz w:val="24"/>
+          <w:szCs w:val="24"/>
+        </w:rPr>
+        <w:t xml:space="preserve">Ebben a tesztben a </w:t>
+      </w:r>
+      <w:r>
+        <w:rPr>
+          <w:rFonts w:ascii="Times New Roman" w:hAnsi="Times New Roman" w:cs="Times New Roman"/>
+          <w:sz w:val="24"/>
+          <w:szCs w:val="24"/>
+        </w:rPr>
+        <w:t>„felhasznaloAdat”</w:t>
+      </w:r>
+      <w:r>
+        <w:rPr>
+          <w:rFonts w:ascii="Times New Roman" w:hAnsi="Times New Roman" w:cs="Times New Roman"/>
+          <w:sz w:val="24"/>
+          <w:szCs w:val="24"/>
+        </w:rPr>
+        <w:t xml:space="preserve"> végpontot teszteljük. Megnézzük, hogy a felhasználók lekérésekor</w:t>
+      </w:r>
+      <w:r>
+        <w:rPr>
+          <w:rFonts w:ascii="Times New Roman" w:hAnsi="Times New Roman" w:cs="Times New Roman"/>
+          <w:sz w:val="28"/>
+          <w:szCs w:val="28"/>
+        </w:rPr>
+        <w:t>:</w:t>
+      </w:r>
+    </w:p>
+    <w:p>
+      <w:pPr>
+        <w:pStyle w:val="Listaszerbekezds"/>
+        <w:numPr>
+          <w:ilvl w:val="0"/>
+          <w:numId w:val="5"/>
+        </w:numPr>
+        <w:rPr>
+          <w:rFonts w:ascii="Times New Roman" w:hAnsi="Times New Roman" w:cs="Times New Roman"/>
+          <w:sz w:val="24"/>
+          <w:szCs w:val="24"/>
+        </w:rPr>
+      </w:pPr>
+      <w:r>
+        <w:rPr>
+          <w:rFonts w:ascii="Times New Roman" w:hAnsi="Times New Roman" w:cs="Times New Roman"/>
+          <w:sz w:val="24"/>
+          <w:szCs w:val="24"/>
+        </w:rPr>
+        <w:lastRenderedPageBreak/>
+        <w:t>200-as státusszal tér vissza</w:t>
+      </w:r>
+    </w:p>
+    <w:p>
+      <w:pPr>
+        <w:pStyle w:val="Listaszerbekezds"/>
+        <w:numPr>
+          <w:ilvl w:val="0"/>
+          <w:numId w:val="5"/>
+        </w:numPr>
+        <w:rPr>
+          <w:rFonts w:ascii="Times New Roman" w:hAnsi="Times New Roman" w:cs="Times New Roman"/>
+          <w:sz w:val="24"/>
+          <w:szCs w:val="24"/>
+        </w:rPr>
+      </w:pPr>
+      <w:r>
+        <w:rPr>
+          <w:rFonts w:ascii="Times New Roman" w:hAnsi="Times New Roman" w:cs="Times New Roman"/>
+          <w:sz w:val="24"/>
+          <w:szCs w:val="24"/>
+        </w:rPr>
+        <w:t>A visszakapott adatok tömb formátumban érkeznek</w:t>
+      </w:r>
+    </w:p>
+    <w:p>
+      <w:pPr>
+        <w:pStyle w:val="Listaszerbekezds"/>
+        <w:numPr>
+          <w:ilvl w:val="0"/>
+          <w:numId w:val="5"/>
+        </w:numPr>
+        <w:rPr>
+          <w:rFonts w:ascii="Times New Roman" w:hAnsi="Times New Roman" w:cs="Times New Roman"/>
+          <w:sz w:val="24"/>
+          <w:szCs w:val="24"/>
+        </w:rPr>
+      </w:pPr>
+      <w:r>
+        <w:rPr>
+          <w:rFonts w:ascii="Times New Roman" w:hAnsi="Times New Roman" w:cs="Times New Roman"/>
+          <w:sz w:val="24"/>
+          <w:szCs w:val="24"/>
+        </w:rPr>
+        <w:t xml:space="preserve">A tömb elemei tartalmazzák a </w:t>
+      </w:r>
+      <w:r>
+        <w:rPr>
+          <w:rFonts w:ascii="Times New Roman" w:hAnsi="Times New Roman" w:cs="Times New Roman"/>
+          <w:sz w:val="24"/>
+          <w:szCs w:val="24"/>
+        </w:rPr>
+        <w:t>felhasznalonev es email</w:t>
+      </w:r>
+      <w:r>
+        <w:rPr>
+          <w:rFonts w:ascii="Times New Roman" w:hAnsi="Times New Roman" w:cs="Times New Roman"/>
+          <w:sz w:val="24"/>
+          <w:szCs w:val="24"/>
+        </w:rPr>
+        <w:t xml:space="preserve"> mezőket</w:t>
+      </w:r>
+    </w:p>
+    <w:p>
+      <w:pPr>
+        <w:rPr>
+          <w:rFonts w:ascii="Times New Roman" w:hAnsi="Times New Roman" w:cs="Times New Roman"/>
+          <w:sz w:val="28"/>
+          <w:szCs w:val="28"/>
+          <w:u w:val="single"/>
+        </w:rPr>
+      </w:pPr>
+      <w:r>
+        <w:rPr>
+          <w:rFonts w:ascii="Times New Roman" w:hAnsi="Times New Roman" w:cs="Times New Roman"/>
+          <w:sz w:val="24"/>
+          <w:szCs w:val="24"/>
+        </w:rPr>
+        <w:drawing>
+          <wp:anchor distT="0" distB="0" distL="114300" distR="114300" simplePos="0" relativeHeight="251662336" behindDoc="0" locked="0" layoutInCell="1" allowOverlap="1" wp14:anchorId="2307F49E" wp14:editId="3DDC163E">
+            <wp:simplePos x="0" y="0"/>
+            <wp:positionH relativeFrom="margin">
+              <wp:align>right</wp:align>
+            </wp:positionH>
+            <wp:positionV relativeFrom="paragraph">
+              <wp:posOffset>379095</wp:posOffset>
+            </wp:positionV>
+            <wp:extent cx="5760720" cy="2464435"/>
+            <wp:effectExtent l="0" t="0" r="0" b="0"/>
+            <wp:wrapSquare wrapText="bothSides"/>
+            <wp:docPr id="1160162973" name="Kép 1"/>
+            <wp:cNvGraphicFramePr>
+              <a:graphicFrameLocks xmlns:a="http://schemas.openxmlformats.org/drawingml/2006/main" noChangeAspect="1"/>
+            </wp:cNvGraphicFramePr>
+            <a:graphic xmlns:a="http://schemas.openxmlformats.org/drawingml/2006/main">
+              <a:graphicData uri="http://schemas.openxmlformats.org/drawingml/2006/picture">
+                <pic:pic xmlns:pic="http://schemas.openxmlformats.org/drawingml/2006/picture">
+                  <pic:nvPicPr>
+                    <pic:cNvPr id="1160162973" name=""/>
+                    <pic:cNvPicPr/>
+                  </pic:nvPicPr>
+                  <pic:blipFill>
+                    <a:blip r:embed="rId15">
+                      <a:extLst>
+                        <a:ext uri="{28A0092B-C50C-407E-A947-70E740481C1C}">
+                          <a14:useLocalDpi xmlns:a14="http://schemas.microsoft.com/office/drawing/2010/main" val="0"/>
+                        </a:ext>
+                      </a:extLst>
+                    </a:blip>
+                    <a:stretch>
+                      <a:fillRect/>
+                    </a:stretch>
+                  </pic:blipFill>
+                  <pic:spPr>
+                    <a:xfrm>
+                      <a:off x="0" y="0"/>
+                      <a:ext cx="5760720" cy="2464435"/>
+                    </a:xfrm>
+                    <a:prstGeom prst="rect">
+                      <a:avLst/>
+                    </a:prstGeom>
+                  </pic:spPr>
+                </pic:pic>
+              </a:graphicData>
+            </a:graphic>
+          </wp:anchor>
+        </w:drawing>
+      </w:r>
+      <w:r>
+        <w:rPr>
+          <w:rFonts w:ascii="Times New Roman" w:hAnsi="Times New Roman" w:cs="Times New Roman"/>
+          <w:sz w:val="28"/>
+          <w:szCs w:val="28"/>
+          <w:u w:val="single"/>
+        </w:rPr>
+        <w:t>Kosárhoz</w:t>
+      </w:r>
+      <w:r>
+        <w:rPr>
+          <w:rFonts w:ascii="Times New Roman" w:hAnsi="Times New Roman" w:cs="Times New Roman"/>
+          <w:sz w:val="28"/>
+          <w:szCs w:val="28"/>
+          <w:u w:val="single"/>
+        </w:rPr>
+        <w:t>a</w:t>
+      </w:r>
+      <w:r>
+        <w:rPr>
+          <w:rFonts w:ascii="Times New Roman" w:hAnsi="Times New Roman" w:cs="Times New Roman"/>
+          <w:sz w:val="28"/>
+          <w:szCs w:val="28"/>
+          <w:u w:val="single"/>
+        </w:rPr>
+        <w:t>dás:</w:t>
+      </w:r>
+    </w:p>
+    <w:p>
+      <w:pPr>
+        <w:rPr>
+          <w:rFonts w:ascii="Times New Roman" w:hAnsi="Times New Roman" w:cs="Times New Roman"/>
+          <w:sz w:val="24"/>
+          <w:szCs w:val="24"/>
+        </w:rPr>
+      </w:pPr>
+      <w:r>
+        <w:rPr>
+          <w:rFonts w:ascii="Times New Roman" w:hAnsi="Times New Roman" w:cs="Times New Roman"/>
+          <w:sz w:val="24"/>
+          <w:szCs w:val="24"/>
+        </w:rPr>
+        <w:t xml:space="preserve">Ebben a tesztben a </w:t>
+      </w:r>
+      <w:r>
+        <w:rPr>
+          <w:rFonts w:ascii="Times New Roman" w:hAnsi="Times New Roman" w:cs="Times New Roman"/>
+          <w:sz w:val="24"/>
+          <w:szCs w:val="24"/>
+        </w:rPr>
+        <w:t>kosárhoz adás</w:t>
+      </w:r>
+      <w:r>
+        <w:rPr>
+          <w:rFonts w:ascii="Times New Roman" w:hAnsi="Times New Roman" w:cs="Times New Roman"/>
+          <w:sz w:val="24"/>
+          <w:szCs w:val="24"/>
+        </w:rPr>
+        <w:t xml:space="preserve"> végpontot teszteljük. Megnézzük, hogy a termék kosárba helyezésekor:</w:t>
+      </w:r>
+    </w:p>
+    <w:p>
+      <w:pPr>
+        <w:pStyle w:val="Listaszerbekezds"/>
+        <w:numPr>
+          <w:ilvl w:val="0"/>
+          <w:numId w:val="6"/>
+        </w:numPr>
+        <w:rPr>
+          <w:rFonts w:ascii="Times New Roman" w:hAnsi="Times New Roman" w:cs="Times New Roman"/>
+          <w:sz w:val="24"/>
+          <w:szCs w:val="24"/>
+        </w:rPr>
+      </w:pPr>
+      <w:r>
+        <w:rPr>
+          <w:rFonts w:ascii="Times New Roman" w:hAnsi="Times New Roman" w:cs="Times New Roman"/>
+          <w:sz w:val="24"/>
+          <w:szCs w:val="24"/>
+        </w:rPr>
+        <w:t>A válasz üzenete megfelel a várt szövegek egyikének</w:t>
+      </w:r>
+    </w:p>
+    <w:p>
+      <w:pPr>
+        <w:pStyle w:val="Listaszerbekezds"/>
+        <w:numPr>
+          <w:ilvl w:val="0"/>
+          <w:numId w:val="6"/>
+        </w:numPr>
+        <w:rPr>
+          <w:rFonts w:ascii="Times New Roman" w:hAnsi="Times New Roman" w:cs="Times New Roman"/>
+          <w:sz w:val="24"/>
+          <w:szCs w:val="24"/>
+        </w:rPr>
+      </w:pPr>
+      <w:r>
+        <w:rPr>
+          <w:rFonts w:ascii="Times New Roman" w:hAnsi="Times New Roman" w:cs="Times New Roman"/>
+          <w:sz w:val="24"/>
+          <w:szCs w:val="24"/>
+        </w:rPr>
+        <w:t>A termék mennyisége legalább 1</w:t>
+      </w:r>
+    </w:p>
+    <w:p>
+      <w:pPr>
+        <w:pStyle w:val="Listaszerbekezds"/>
+        <w:numPr>
+          <w:ilvl w:val="0"/>
+          <w:numId w:val="6"/>
+        </w:numPr>
+        <w:rPr>
+          <w:rFonts w:ascii="Times New Roman" w:hAnsi="Times New Roman" w:cs="Times New Roman"/>
+          <w:sz w:val="24"/>
+          <w:szCs w:val="24"/>
+        </w:rPr>
+      </w:pPr>
+      <w:r>
+        <w:rPr>
+          <w:rFonts w:ascii="Times New Roman" w:hAnsi="Times New Roman" w:cs="Times New Roman"/>
+          <w:sz w:val="24"/>
+          <w:szCs w:val="24"/>
+        </w:rPr>
+        <w:t>Hiba esetén a megfelelő hibaüzenet érkezik vissza</w:t>
+      </w:r>
+    </w:p>
+    <w:p>
+      <w:pPr>
+        <w:pStyle w:val="Cmsor1"/>
         <w:rPr>
           <w:rFonts w:ascii="Times New Roman" w:hAnsi="Times New Roman" w:cs="Times New Roman"/>
         </w:rPr>
@@ -2467,7 +2850,244 @@
     </w:p>
     <w:p>
       <w:pPr>
-        <w:pStyle w:val="Heading1"/>
+        <w:rPr>
+          <w:rFonts w:ascii="Times New Roman" w:hAnsi="Times New Roman" w:cs="Times New Roman"/>
+          <w:sz w:val="28"/>
+          <w:szCs w:val="28"/>
+        </w:rPr>
+      </w:pPr>
+      <w:r>
+        <w:rPr>
+          <w:rFonts w:ascii="Times New Roman" w:hAnsi="Times New Roman" w:cs="Times New Roman"/>
+          <w:sz w:val="28"/>
+          <w:szCs w:val="28"/>
+        </w:rPr>
+        <w:t>Valós fizetési integráció</w:t>
+      </w:r>
+    </w:p>
+    <w:p>
+      <w:pPr>
+        <w:rPr>
+          <w:rFonts w:ascii="Times New Roman" w:hAnsi="Times New Roman" w:cs="Times New Roman"/>
+          <w:sz w:val="24"/>
+          <w:szCs w:val="24"/>
+        </w:rPr>
+      </w:pPr>
+      <w:r>
+        <w:rPr>
+          <w:rFonts w:ascii="Times New Roman" w:hAnsi="Times New Roman" w:cs="Times New Roman"/>
+          <w:sz w:val="24"/>
+          <w:szCs w:val="24"/>
+        </w:rPr>
+        <w:t xml:space="preserve">Jelenleg a fizetési funkció csak demonstrációs célú, valódi tranzakciókat nem kezel. Egy éles rendszerben érdemes lenne valódi fizetési kaput integrálni, például </w:t>
+      </w:r>
+      <w:r>
+        <w:rPr>
+          <w:rFonts w:ascii="Times New Roman" w:hAnsi="Times New Roman" w:cs="Times New Roman"/>
+          <w:sz w:val="24"/>
+          <w:szCs w:val="24"/>
+        </w:rPr>
+        <w:t>PayPal</w:t>
+      </w:r>
+      <w:r>
+        <w:rPr>
+          <w:rFonts w:ascii="Times New Roman" w:hAnsi="Times New Roman" w:cs="Times New Roman"/>
+          <w:sz w:val="24"/>
+          <w:szCs w:val="24"/>
+        </w:rPr>
+        <w:t xml:space="preserve">, </w:t>
+      </w:r>
+      <w:r>
+        <w:rPr>
+          <w:rFonts w:ascii="Times New Roman" w:hAnsi="Times New Roman" w:cs="Times New Roman"/>
+          <w:sz w:val="24"/>
+          <w:szCs w:val="24"/>
+        </w:rPr>
+        <w:t>Apple Pay</w:t>
+      </w:r>
+      <w:r>
+        <w:rPr>
+          <w:rFonts w:ascii="Times New Roman" w:hAnsi="Times New Roman" w:cs="Times New Roman"/>
+          <w:sz w:val="24"/>
+          <w:szCs w:val="24"/>
+        </w:rPr>
+        <w:t xml:space="preserve"> vagy SimplePay szolgáltatással, amely bankkártyás és online fizetést tenne lehetővé.</w:t>
+      </w:r>
+    </w:p>
+    <w:p>
+      <w:pPr>
+        <w:rPr>
+          <w:rFonts w:ascii="Times New Roman" w:hAnsi="Times New Roman" w:cs="Times New Roman"/>
+          <w:sz w:val="28"/>
+          <w:szCs w:val="28"/>
+        </w:rPr>
+      </w:pPr>
+      <w:r>
+        <w:rPr>
+          <w:rFonts w:ascii="Times New Roman" w:hAnsi="Times New Roman" w:cs="Times New Roman"/>
+          <w:sz w:val="28"/>
+          <w:szCs w:val="28"/>
+        </w:rPr>
+        <w:t>Termékértékelési és véleményezési rendszer</w:t>
+      </w:r>
+    </w:p>
+    <w:p>
+      <w:pPr>
+        <w:rPr>
+          <w:rFonts w:ascii="Times New Roman" w:hAnsi="Times New Roman" w:cs="Times New Roman"/>
+          <w:sz w:val="24"/>
+          <w:szCs w:val="24"/>
+        </w:rPr>
+      </w:pPr>
+      <w:r>
+        <w:rPr>
+          <w:rFonts w:ascii="Times New Roman" w:hAnsi="Times New Roman" w:cs="Times New Roman"/>
+          <w:sz w:val="24"/>
+          <w:szCs w:val="24"/>
+        </w:rPr>
+        <w:t>A felhasználók jelenleg nem tudnak visszajelzést adni a megvásárolt termékekről. Egy csillagos értékelési és szöveges vélemény funkció növelné a vásárlói bizalmat és segítené a többi felhasználó döntéshozatalát.</w:t>
+      </w:r>
+    </w:p>
+    <w:p>
+      <w:pPr>
+        <w:rPr>
+          <w:rFonts w:ascii="Times New Roman" w:hAnsi="Times New Roman" w:cs="Times New Roman"/>
+          <w:sz w:val="28"/>
+          <w:szCs w:val="28"/>
+        </w:rPr>
+      </w:pPr>
+      <w:r>
+        <w:rPr>
+          <w:rFonts w:ascii="Times New Roman" w:hAnsi="Times New Roman" w:cs="Times New Roman"/>
+          <w:sz w:val="28"/>
+          <w:szCs w:val="28"/>
+        </w:rPr>
+        <w:t>Fejlettebb keresés és szűrés</w:t>
+      </w:r>
+    </w:p>
+    <w:p>
+      <w:pPr>
+        <w:rPr>
+          <w:rFonts w:ascii="Times New Roman" w:hAnsi="Times New Roman" w:cs="Times New Roman"/>
+          <w:sz w:val="24"/>
+          <w:szCs w:val="24"/>
+        </w:rPr>
+      </w:pPr>
+      <w:r>
+        <w:rPr>
+          <w:rFonts w:ascii="Times New Roman" w:hAnsi="Times New Roman" w:cs="Times New Roman"/>
+          <w:sz w:val="24"/>
+          <w:szCs w:val="24"/>
+        </w:rPr>
+        <w:t>A jelenlegi szűrési lehetőségek (kategória, ár, akció, készlet) tovább bővíthetők lennének márka, anyag vagy egyéb termékjellemzők szerinti szűréssel, illetve fejlettebb keresési algoritmussal, amely elírásokat is kezel.</w:t>
+      </w:r>
+    </w:p>
+    <w:p>
+      <w:pPr>
+        <w:rPr>
+          <w:rFonts w:ascii="Times New Roman" w:hAnsi="Times New Roman" w:cs="Times New Roman"/>
+          <w:sz w:val="28"/>
+          <w:szCs w:val="28"/>
+        </w:rPr>
+      </w:pPr>
+      <w:r>
+        <w:rPr>
+          <w:rFonts w:ascii="Times New Roman" w:hAnsi="Times New Roman" w:cs="Times New Roman"/>
+          <w:sz w:val="28"/>
+          <w:szCs w:val="28"/>
+        </w:rPr>
+        <w:t>Mobilalkalmazás készítése</w:t>
+      </w:r>
+    </w:p>
+    <w:p>
+      <w:pPr>
+        <w:rPr>
+          <w:rFonts w:ascii="Times New Roman" w:hAnsi="Times New Roman" w:cs="Times New Roman"/>
+          <w:sz w:val="24"/>
+          <w:szCs w:val="24"/>
+        </w:rPr>
+      </w:pPr>
+      <w:r>
+        <w:rPr>
+          <w:rFonts w:ascii="Times New Roman" w:hAnsi="Times New Roman" w:cs="Times New Roman"/>
+          <w:sz w:val="24"/>
+          <w:szCs w:val="24"/>
+        </w:rPr>
+        <w:t>A webshop jelenleg reszponzív webfelületen érhető el. Egy natív Android vagy iOS alkalmazás – push értesítésekkel, egyszerűbb mobilos kosárkezeléssel – jelentősen javíthatná a felhasználói élményt.</w:t>
+      </w:r>
+    </w:p>
+    <w:p>
+      <w:pPr>
+        <w:rPr>
+          <w:rFonts w:ascii="Times New Roman" w:hAnsi="Times New Roman" w:cs="Times New Roman"/>
+          <w:sz w:val="28"/>
+          <w:szCs w:val="28"/>
+        </w:rPr>
+      </w:pPr>
+      <w:r>
+        <w:rPr>
+          <w:rFonts w:ascii="Times New Roman" w:hAnsi="Times New Roman" w:cs="Times New Roman"/>
+          <w:sz w:val="28"/>
+          <w:szCs w:val="28"/>
+        </w:rPr>
+        <w:lastRenderedPageBreak/>
+        <w:t>Szállítási opciók bővítése</w:t>
+      </w:r>
+    </w:p>
+    <w:p>
+      <w:pPr>
+        <w:rPr>
+          <w:rFonts w:ascii="Times New Roman" w:hAnsi="Times New Roman" w:cs="Times New Roman"/>
+          <w:sz w:val="24"/>
+          <w:szCs w:val="24"/>
+        </w:rPr>
+      </w:pPr>
+      <w:r>
+        <w:rPr>
+          <w:rFonts w:ascii="Times New Roman" w:hAnsi="Times New Roman" w:cs="Times New Roman"/>
+          <w:sz w:val="24"/>
+          <w:szCs w:val="24"/>
+        </w:rPr>
+        <w:t>A rendszer jelenleg szállítási cím kiválasztását teszi lehetővé, azonban valódi szállítási szolgáltatók (pl. GLS, DPD, Magyar Posta) integrációjával és csomagkövetési funkcióval teljesebbé válhatna a rendelési folyamat.</w:t>
+      </w:r>
+    </w:p>
+    <w:p>
+      <w:pPr>
+        <w:rPr>
+          <w:rFonts w:ascii="Times New Roman" w:hAnsi="Times New Roman" w:cs="Times New Roman"/>
+          <w:sz w:val="28"/>
+          <w:szCs w:val="28"/>
+        </w:rPr>
+      </w:pPr>
+      <w:r>
+        <w:rPr>
+          <w:rFonts w:ascii="Times New Roman" w:hAnsi="Times New Roman" w:cs="Times New Roman"/>
+          <w:sz w:val="28"/>
+          <w:szCs w:val="28"/>
+        </w:rPr>
+        <w:t>Hűségprogram és kuponrendszer</w:t>
+      </w:r>
+    </w:p>
+    <w:p>
+      <w:pPr>
+        <w:rPr>
+          <w:rFonts w:ascii="Times New Roman" w:hAnsi="Times New Roman" w:cs="Times New Roman"/>
+          <w:sz w:val="24"/>
+          <w:szCs w:val="24"/>
+        </w:rPr>
+      </w:pPr>
+      <w:r>
+        <w:rPr>
+          <w:rFonts w:ascii="Times New Roman" w:hAnsi="Times New Roman" w:cs="Times New Roman"/>
+          <w:sz w:val="24"/>
+          <w:szCs w:val="24"/>
+        </w:rPr>
+        <w:t>A törzsvásárlók statisztikája már elérhető az admin felületen, azonban nincs hozzá hűségprogram. Pontgyűjtési rendszer vagy egyedi kupónkódok bevezetése ösztönözhetné az ismételt vásárlást.</w:t>
+      </w:r>
+    </w:p>
+    <w:p>
+      <w:pPr>
+        <w:pStyle w:val="Cmsor1"/>
         <w:rPr>
           <w:rFonts w:ascii="Times New Roman" w:hAnsi="Times New Roman" w:cs="Times New Roman"/>
         </w:rPr>
@@ -2481,7 +3101,7 @@
     </w:p>
     <w:p>
       <w:pPr>
-        <w:pStyle w:val="ListParagraph"/>
+        <w:pStyle w:val="Listaszerbekezds"/>
         <w:numPr>
           <w:ilvl w:val="0"/>
           <w:numId w:val="3"/>
@@ -2508,10 +3128,10 @@
         </w:rPr>
         <w:t xml:space="preserve">tintható táblázat stackoverflow </w:t>
       </w:r>
-      <w:hyperlink r:id="rId14" w:history="1">
+      <w:hyperlink r:id="rId16" w:history="1">
         <w:r>
           <w:rPr>
-            <w:rStyle w:val="Hyperlink"/>
+            <w:rStyle w:val="Hiperhivatkozs"/>
             <w:rFonts w:ascii="Times New Roman" w:hAnsi="Times New Roman" w:cs="Times New Roman"/>
             <w:sz w:val="24"/>
             <w:szCs w:val="24"/>
@@ -2530,7 +3150,7 @@
     </w:p>
     <w:p>
       <w:pPr>
-        <w:pStyle w:val="ListParagraph"/>
+        <w:pStyle w:val="Listaszerbekezds"/>
         <w:numPr>
           <w:ilvl w:val="0"/>
           <w:numId w:val="3"/>
@@ -2549,10 +3169,10 @@
         </w:rPr>
         <w:t xml:space="preserve">Grafikonok W3schools </w:t>
       </w:r>
-      <w:hyperlink r:id="rId15" w:history="1">
+      <w:hyperlink r:id="rId17" w:history="1">
         <w:r>
           <w:rPr>
-            <w:rStyle w:val="Hyperlink"/>
+            <w:rStyle w:val="Hiperhivatkozs"/>
             <w:rFonts w:ascii="Times New Roman" w:hAnsi="Times New Roman" w:cs="Times New Roman"/>
             <w:sz w:val="24"/>
             <w:szCs w:val="24"/>
@@ -2582,6 +3202,232 @@
 <file path=word/numbering.xml><?xml version="1.0" encoding="utf-8"?>
 <w:numbering xmlns:wpc="http://schemas.microsoft.com/office/word/2010/wordprocessingCanvas" xmlns:cx="http://schemas.microsoft.com/office/drawing/2014/chartex" xmlns:cx1="http://schemas.microsoft.com/office/drawing/2015/9/8/chartex" xmlns:cx2="http://schemas.microsoft.com/office/drawing/2015/10/21/chartex" xmlns:cx3="http://schemas.microsoft.com/office/drawing/2016/5/9/chartex" xmlns:cx4="http://schemas.microsoft.com/office/drawing/2016/5/10/chartex" xmlns:cx5="http://schemas.microsoft.com/office/drawing/2016/5/11/chartex" xmlns:cx6="http://schemas.microsoft.com/office/drawing/2016/5/12/chartex" xmlns:cx7="http://schemas.microsoft.com/office/drawing/2016/5/13/chartex" xmlns:cx8="http://schemas.microsoft.com/office/drawing/2016/5/14/chartex" xmlns:mc="http://schemas.openxmlformats.org/markup-compatibility/2006" xmlns:aink="http://schemas.microsoft.com/office/drawing/2016/ink" xmlns:am3d="http://schemas.microsoft.com/office/drawing/2017/model3d" xmlns:o="urn:schemas-microsoft-com:office:office" xmlns:oel="http://schemas.microsoft.com/office/2019/extlst" xmlns:r="http://schemas.openxmlformats.org/officeDocument/2006/relationships" xmlns:m="http://schemas.openxmlformats.org/officeDocument/2006/math" xmlns:v="urn:schemas-microsoft-com:vml" xmlns:wp14="http://schemas.microsoft.com/office/word/2010/wordprocessingDrawing" xmlns:wp="http://schemas.openxmlformats.org/drawingml/2006/wordprocessingDrawing" xmlns:w10="urn:schemas-microsoft-com:office:word" xmlns:w="http://schemas.openxmlformats.org/wordprocessingml/2006/main" xmlns:w14="http://schemas.microsoft.com/office/word/2010/wordml" xmlns:w15="http://schemas.microsoft.com/office/word/2012/wordml" xmlns:w16cex="http://schemas.microsoft.com/office/word/2018/wordml/cex" xmlns:w16cid="http://schemas.microsoft.com/office/word/2016/wordml/cid" xmlns:w16="http://schemas.microsoft.com/office/word/2018/wordml" xmlns:w16du="http://schemas.microsoft.com/office/word/2023/wordml/word16du" xmlns:w16sdtdh="http://schemas.microsoft.com/office/word/2020/wordml/sdtdatahash" xmlns:w16sdtfl="http://schemas.microsoft.com/office/word/2024/wordml/sdtformatlock" xmlns:w16se="http://schemas.microsoft.com/office/word/2015/wordml/symex" xmlns:wpg="http://schemas.microsoft.com/office/word/2010/wordprocessingGroup" xmlns:wpi="http://schemas.microsoft.com/office/word/2010/wordprocessingInk" xmlns:wne="http://schemas.microsoft.com/office/word/2006/wordml" xmlns:wps="http://schemas.microsoft.com/office/word/2010/wordprocessingShape" mc:Ignorable="w14 w15 w16se w16cid w16 w16cex w16sdtdh w16sdtfl w16du wp14">
   <w:abstractNum w:abstractNumId="0" w15:restartNumberingAfterBreak="0">
+    <w:nsid w:val="08815D2A"/>
+    <w:multiLevelType w:val="hybridMultilevel"/>
+    <w:tmpl w:val="AE488956"/>
+    <w:lvl w:ilvl="0" w:tplc="040E0001">
+      <w:start w:val="1"/>
+      <w:numFmt w:val="bullet"/>
+      <w:lvlText w:val=""/>
+      <w:lvlJc w:val="left"/>
+      <w:pPr>
+        <w:ind w:left="720" w:hanging="360"/>
+      </w:pPr>
+      <w:rPr>
+        <w:rFonts w:ascii="Symbol" w:hAnsi="Symbol" w:hint="default"/>
+      </w:rPr>
+    </w:lvl>
+    <w:lvl w:ilvl="1" w:tplc="040E0003" w:tentative="1">
+      <w:start w:val="1"/>
+      <w:numFmt w:val="bullet"/>
+      <w:lvlText w:val="o"/>
+      <w:lvlJc w:val="left"/>
+      <w:pPr>
+        <w:ind w:left="1440" w:hanging="360"/>
+      </w:pPr>
+      <w:rPr>
+        <w:rFonts w:ascii="Courier New" w:hAnsi="Courier New" w:cs="Courier New" w:hint="default"/>
+      </w:rPr>
+    </w:lvl>
+    <w:lvl w:ilvl="2" w:tplc="040E0005" w:tentative="1">
+      <w:start w:val="1"/>
+      <w:numFmt w:val="bullet"/>
+      <w:lvlText w:val=""/>
+      <w:lvlJc w:val="left"/>
+      <w:pPr>
+        <w:ind w:left="2160" w:hanging="360"/>
+      </w:pPr>
+      <w:rPr>
+        <w:rFonts w:ascii="Wingdings" w:hAnsi="Wingdings" w:hint="default"/>
+      </w:rPr>
+    </w:lvl>
+    <w:lvl w:ilvl="3" w:tplc="040E0001" w:tentative="1">
+      <w:start w:val="1"/>
+      <w:numFmt w:val="bullet"/>
+      <w:lvlText w:val=""/>
+      <w:lvlJc w:val="left"/>
+      <w:pPr>
+        <w:ind w:left="2880" w:hanging="360"/>
+      </w:pPr>
+      <w:rPr>
+        <w:rFonts w:ascii="Symbol" w:hAnsi="Symbol" w:hint="default"/>
+      </w:rPr>
+    </w:lvl>
+    <w:lvl w:ilvl="4" w:tplc="040E0003" w:tentative="1">
+      <w:start w:val="1"/>
+      <w:numFmt w:val="bullet"/>
+      <w:lvlText w:val="o"/>
+      <w:lvlJc w:val="left"/>
+      <w:pPr>
+        <w:ind w:left="3600" w:hanging="360"/>
+      </w:pPr>
+      <w:rPr>
+        <w:rFonts w:ascii="Courier New" w:hAnsi="Courier New" w:cs="Courier New" w:hint="default"/>
+      </w:rPr>
+    </w:lvl>
+    <w:lvl w:ilvl="5" w:tplc="040E0005" w:tentative="1">
+      <w:start w:val="1"/>
+      <w:numFmt w:val="bullet"/>
+      <w:lvlText w:val=""/>
+      <w:lvlJc w:val="left"/>
+      <w:pPr>
+        <w:ind w:left="4320" w:hanging="360"/>
+      </w:pPr>
+      <w:rPr>
+        <w:rFonts w:ascii="Wingdings" w:hAnsi="Wingdings" w:hint="default"/>
+      </w:rPr>
+    </w:lvl>
+    <w:lvl w:ilvl="6" w:tplc="040E0001" w:tentative="1">
+      <w:start w:val="1"/>
+      <w:numFmt w:val="bullet"/>
+      <w:lvlText w:val=""/>
+      <w:lvlJc w:val="left"/>
+      <w:pPr>
+        <w:ind w:left="5040" w:hanging="360"/>
+      </w:pPr>
+      <w:rPr>
+        <w:rFonts w:ascii="Symbol" w:hAnsi="Symbol" w:hint="default"/>
+      </w:rPr>
+    </w:lvl>
+    <w:lvl w:ilvl="7" w:tplc="040E0003" w:tentative="1">
+      <w:start w:val="1"/>
+      <w:numFmt w:val="bullet"/>
+      <w:lvlText w:val="o"/>
+      <w:lvlJc w:val="left"/>
+      <w:pPr>
+        <w:ind w:left="5760" w:hanging="360"/>
+      </w:pPr>
+      <w:rPr>
+        <w:rFonts w:ascii="Courier New" w:hAnsi="Courier New" w:cs="Courier New" w:hint="default"/>
+      </w:rPr>
+    </w:lvl>
+    <w:lvl w:ilvl="8" w:tplc="040E0005" w:tentative="1">
+      <w:start w:val="1"/>
+      <w:numFmt w:val="bullet"/>
+      <w:lvlText w:val=""/>
+      <w:lvlJc w:val="left"/>
+      <w:pPr>
+        <w:ind w:left="6480" w:hanging="360"/>
+      </w:pPr>
+      <w:rPr>
+        <w:rFonts w:ascii="Wingdings" w:hAnsi="Wingdings" w:hint="default"/>
+      </w:rPr>
+    </w:lvl>
+  </w:abstractNum>
+  <w:abstractNum w:abstractNumId="1" w15:restartNumberingAfterBreak="0">
+    <w:nsid w:val="1A5C662D"/>
+    <w:multiLevelType w:val="hybridMultilevel"/>
+    <w:tmpl w:val="4B6A6F42"/>
+    <w:lvl w:ilvl="0" w:tplc="040E0001">
+      <w:start w:val="1"/>
+      <w:numFmt w:val="bullet"/>
+      <w:lvlText w:val=""/>
+      <w:lvlJc w:val="left"/>
+      <w:pPr>
+        <w:ind w:left="720" w:hanging="360"/>
+      </w:pPr>
+      <w:rPr>
+        <w:rFonts w:ascii="Symbol" w:hAnsi="Symbol" w:hint="default"/>
+      </w:rPr>
+    </w:lvl>
+    <w:lvl w:ilvl="1" w:tplc="040E0003" w:tentative="1">
+      <w:start w:val="1"/>
+      <w:numFmt w:val="bullet"/>
+      <w:lvlText w:val="o"/>
+      <w:lvlJc w:val="left"/>
+      <w:pPr>
+        <w:ind w:left="1440" w:hanging="360"/>
+      </w:pPr>
+      <w:rPr>
+        <w:rFonts w:ascii="Courier New" w:hAnsi="Courier New" w:cs="Courier New" w:hint="default"/>
+      </w:rPr>
+    </w:lvl>
+    <w:lvl w:ilvl="2" w:tplc="040E0005" w:tentative="1">
+      <w:start w:val="1"/>
+      <w:numFmt w:val="bullet"/>
+      <w:lvlText w:val=""/>
+      <w:lvlJc w:val="left"/>
+      <w:pPr>
+        <w:ind w:left="2160" w:hanging="360"/>
+      </w:pPr>
+      <w:rPr>
+        <w:rFonts w:ascii="Wingdings" w:hAnsi="Wingdings" w:hint="default"/>
+      </w:rPr>
+    </w:lvl>
+    <w:lvl w:ilvl="3" w:tplc="040E0001" w:tentative="1">
+      <w:start w:val="1"/>
+      <w:numFmt w:val="bullet"/>
+      <w:lvlText w:val=""/>
+      <w:lvlJc w:val="left"/>
+      <w:pPr>
+        <w:ind w:left="2880" w:hanging="360"/>
+      </w:pPr>
+      <w:rPr>
+        <w:rFonts w:ascii="Symbol" w:hAnsi="Symbol" w:hint="default"/>
+      </w:rPr>
+    </w:lvl>
+    <w:lvl w:ilvl="4" w:tplc="040E0003" w:tentative="1">
+      <w:start w:val="1"/>
+      <w:numFmt w:val="bullet"/>
+      <w:lvlText w:val="o"/>
+      <w:lvlJc w:val="left"/>
+      <w:pPr>
+        <w:ind w:left="3600" w:hanging="360"/>
+      </w:pPr>
+      <w:rPr>
+        <w:rFonts w:ascii="Courier New" w:hAnsi="Courier New" w:cs="Courier New" w:hint="default"/>
+      </w:rPr>
+    </w:lvl>
+    <w:lvl w:ilvl="5" w:tplc="040E0005" w:tentative="1">
+      <w:start w:val="1"/>
+      <w:numFmt w:val="bullet"/>
+      <w:lvlText w:val=""/>
+      <w:lvlJc w:val="left"/>
+      <w:pPr>
+        <w:ind w:left="4320" w:hanging="360"/>
+      </w:pPr>
+      <w:rPr>
+        <w:rFonts w:ascii="Wingdings" w:hAnsi="Wingdings" w:hint="default"/>
+      </w:rPr>
+    </w:lvl>
+    <w:lvl w:ilvl="6" w:tplc="040E0001" w:tentative="1">
+      <w:start w:val="1"/>
+      <w:numFmt w:val="bullet"/>
+      <w:lvlText w:val=""/>
+      <w:lvlJc w:val="left"/>
+      <w:pPr>
+        <w:ind w:left="5040" w:hanging="360"/>
+      </w:pPr>
+      <w:rPr>
+        <w:rFonts w:ascii="Symbol" w:hAnsi="Symbol" w:hint="default"/>
+      </w:rPr>
+    </w:lvl>
+    <w:lvl w:ilvl="7" w:tplc="040E0003" w:tentative="1">
+      <w:start w:val="1"/>
+      <w:numFmt w:val="bullet"/>
+      <w:lvlText w:val="o"/>
+      <w:lvlJc w:val="left"/>
+      <w:pPr>
+        <w:ind w:left="5760" w:hanging="360"/>
+      </w:pPr>
+      <w:rPr>
+        <w:rFonts w:ascii="Courier New" w:hAnsi="Courier New" w:cs="Courier New" w:hint="default"/>
+      </w:rPr>
+    </w:lvl>
+    <w:lvl w:ilvl="8" w:tplc="040E0005" w:tentative="1">
+      <w:start w:val="1"/>
+      <w:numFmt w:val="bullet"/>
+      <w:lvlText w:val=""/>
+      <w:lvlJc w:val="left"/>
+      <w:pPr>
+        <w:ind w:left="6480" w:hanging="360"/>
+      </w:pPr>
+      <w:rPr>
+        <w:rFonts w:ascii="Wingdings" w:hAnsi="Wingdings" w:hint="default"/>
+      </w:rPr>
+    </w:lvl>
+  </w:abstractNum>
+  <w:abstractNum w:abstractNumId="2" w15:restartNumberingAfterBreak="0">
     <w:nsid w:val="43E26B94"/>
     <w:multiLevelType w:val="hybridMultilevel"/>
     <w:tmpl w:val="DB2A5DE8"/>
@@ -2694,7 +3540,120 @@
       </w:rPr>
     </w:lvl>
   </w:abstractNum>
-  <w:abstractNum w:abstractNumId="1" w15:restartNumberingAfterBreak="0">
+  <w:abstractNum w:abstractNumId="3" w15:restartNumberingAfterBreak="0">
+    <w:nsid w:val="4A195614"/>
+    <w:multiLevelType w:val="hybridMultilevel"/>
+    <w:tmpl w:val="133E8138"/>
+    <w:lvl w:ilvl="0" w:tplc="040E0001">
+      <w:start w:val="1"/>
+      <w:numFmt w:val="bullet"/>
+      <w:lvlText w:val=""/>
+      <w:lvlJc w:val="left"/>
+      <w:pPr>
+        <w:ind w:left="720" w:hanging="360"/>
+      </w:pPr>
+      <w:rPr>
+        <w:rFonts w:ascii="Symbol" w:hAnsi="Symbol" w:hint="default"/>
+      </w:rPr>
+    </w:lvl>
+    <w:lvl w:ilvl="1" w:tplc="040E0003" w:tentative="1">
+      <w:start w:val="1"/>
+      <w:numFmt w:val="bullet"/>
+      <w:lvlText w:val="o"/>
+      <w:lvlJc w:val="left"/>
+      <w:pPr>
+        <w:ind w:left="1440" w:hanging="360"/>
+      </w:pPr>
+      <w:rPr>
+        <w:rFonts w:ascii="Courier New" w:hAnsi="Courier New" w:cs="Courier New" w:hint="default"/>
+      </w:rPr>
+    </w:lvl>
+    <w:lvl w:ilvl="2" w:tplc="040E0005" w:tentative="1">
+      <w:start w:val="1"/>
+      <w:numFmt w:val="bullet"/>
+      <w:lvlText w:val=""/>
+      <w:lvlJc w:val="left"/>
+      <w:pPr>
+        <w:ind w:left="2160" w:hanging="360"/>
+      </w:pPr>
+      <w:rPr>
+        <w:rFonts w:ascii="Wingdings" w:hAnsi="Wingdings" w:hint="default"/>
+      </w:rPr>
+    </w:lvl>
+    <w:lvl w:ilvl="3" w:tplc="040E0001" w:tentative="1">
+      <w:start w:val="1"/>
+      <w:numFmt w:val="bullet"/>
+      <w:lvlText w:val=""/>
+      <w:lvlJc w:val="left"/>
+      <w:pPr>
+        <w:ind w:left="2880" w:hanging="360"/>
+      </w:pPr>
+      <w:rPr>
+        <w:rFonts w:ascii="Symbol" w:hAnsi="Symbol" w:hint="default"/>
+      </w:rPr>
+    </w:lvl>
+    <w:lvl w:ilvl="4" w:tplc="040E0003" w:tentative="1">
+      <w:start w:val="1"/>
+      <w:numFmt w:val="bullet"/>
+      <w:lvlText w:val="o"/>
+      <w:lvlJc w:val="left"/>
+      <w:pPr>
+        <w:ind w:left="3600" w:hanging="360"/>
+      </w:pPr>
+      <w:rPr>
+        <w:rFonts w:ascii="Courier New" w:hAnsi="Courier New" w:cs="Courier New" w:hint="default"/>
+      </w:rPr>
+    </w:lvl>
+    <w:lvl w:ilvl="5" w:tplc="040E0005" w:tentative="1">
+      <w:start w:val="1"/>
+      <w:numFmt w:val="bullet"/>
+      <w:lvlText w:val=""/>
+      <w:lvlJc w:val="left"/>
+      <w:pPr>
+        <w:ind w:left="4320" w:hanging="360"/>
+      </w:pPr>
+      <w:rPr>
+        <w:rFonts w:ascii="Wingdings" w:hAnsi="Wingdings" w:hint="default"/>
+      </w:rPr>
+    </w:lvl>
+    <w:lvl w:ilvl="6" w:tplc="040E0001" w:tentative="1">
+      <w:start w:val="1"/>
+      <w:numFmt w:val="bullet"/>
+      <w:lvlText w:val=""/>
+      <w:lvlJc w:val="left"/>
+      <w:pPr>
+        <w:ind w:left="5040" w:hanging="360"/>
+      </w:pPr>
+      <w:rPr>
+        <w:rFonts w:ascii="Symbol" w:hAnsi="Symbol" w:hint="default"/>
+      </w:rPr>
+    </w:lvl>
+    <w:lvl w:ilvl="7" w:tplc="040E0003" w:tentative="1">
+      <w:start w:val="1"/>
+      <w:numFmt w:val="bullet"/>
+      <w:lvlText w:val="o"/>
+      <w:lvlJc w:val="left"/>
+      <w:pPr>
+        <w:ind w:left="5760" w:hanging="360"/>
+      </w:pPr>
+      <w:rPr>
+        <w:rFonts w:ascii="Courier New" w:hAnsi="Courier New" w:cs="Courier New" w:hint="default"/>
+      </w:rPr>
+    </w:lvl>
+    <w:lvl w:ilvl="8" w:tplc="040E0005" w:tentative="1">
+      <w:start w:val="1"/>
+      <w:numFmt w:val="bullet"/>
+      <w:lvlText w:val=""/>
+      <w:lvlJc w:val="left"/>
+      <w:pPr>
+        <w:ind w:left="6480" w:hanging="360"/>
+      </w:pPr>
+      <w:rPr>
+        <w:rFonts w:ascii="Wingdings" w:hAnsi="Wingdings" w:hint="default"/>
+      </w:rPr>
+    </w:lvl>
+  </w:abstractNum>
+  <w:abstractNum w:abstractNumId="4" w15:restartNumberingAfterBreak="0">
     <w:nsid w:val="583354E3"/>
     <w:multiLevelType w:val="hybridMultilevel"/>
     <w:tmpl w:val="8850DE64"/>
@@ -2807,7 +3766,7 @@
       </w:rPr>
     </w:lvl>
   </w:abstractNum>
-  <w:abstractNum w:abstractNumId="2" w15:restartNumberingAfterBreak="0">
+  <w:abstractNum w:abstractNumId="5" w15:restartNumberingAfterBreak="0">
     <w:nsid w:val="70BF1CA4"/>
     <w:multiLevelType w:val="hybridMultilevel"/>
     <w:tmpl w:val="FC0860B6"/>
@@ -2921,13 +3880,22 @@
     </w:lvl>
   </w:abstractNum>
   <w:num w:numId="1" w16cid:durableId="1091195399">
+    <w:abstractNumId w:val="5"/>
+  </w:num>
+  <w:num w:numId="2" w16cid:durableId="1891261778">
+    <w:abstractNumId w:val="4"/>
+  </w:num>
+  <w:num w:numId="3" w16cid:durableId="398139325">
     <w:abstractNumId w:val="2"/>
   </w:num>
-  <w:num w:numId="2" w16cid:durableId="1891261778">
+  <w:num w:numId="4" w16cid:durableId="1186602085">
+    <w:abstractNumId w:val="0"/>
+  </w:num>
+  <w:num w:numId="5" w16cid:durableId="1823961133">
+    <w:abstractNumId w:val="3"/>
+  </w:num>
+  <w:num w:numId="6" w16cid:durableId="1927181093">
     <w:abstractNumId w:val="1"/>
-  </w:num>
-  <w:num w:numId="3" w16cid:durableId="398139325">
-    <w:abstractNumId w:val="0"/>
   </w:num>
 </w:numbering>
 </file>
@@ -3327,16 +4295,16 @@
     <w:lsdException w:name="Unresolved Mention" w:semiHidden="1" w:unhideWhenUsed="1"/>
     <w:lsdException w:name="Smart Link" w:semiHidden="1" w:unhideWhenUsed="1"/>
   </w:latentStyles>
-  <w:style w:type="paragraph" w:default="1" w:styleId="Normal">
+  <w:style w:type="paragraph" w:default="1" w:styleId="Norml">
     <w:name w:val="Normal"/>
     <w:qFormat/>
     <w:rsid w:val="00BA3AA0"/>
   </w:style>
-  <w:style w:type="paragraph" w:styleId="Heading1">
+  <w:style w:type="paragraph" w:styleId="Cmsor1">
     <w:name w:val="heading 1"/>
-    <w:basedOn w:val="Normal"/>
-    <w:next w:val="Normal"/>
-    <w:link w:val="Heading1Char"/>
+    <w:basedOn w:val="Norml"/>
+    <w:next w:val="Norml"/>
+    <w:link w:val="Cmsor1Char"/>
     <w:uiPriority w:val="9"/>
     <w:qFormat/>
     <w:rsid w:val="00402772"/>
@@ -3352,11 +4320,11 @@
       <w:szCs w:val="32"/>
     </w:rPr>
   </w:style>
-  <w:style w:type="paragraph" w:styleId="Heading2">
+  <w:style w:type="paragraph" w:styleId="Cmsor2">
     <w:name w:val="heading 2"/>
-    <w:basedOn w:val="Normal"/>
-    <w:next w:val="Normal"/>
-    <w:link w:val="Heading2Char"/>
+    <w:basedOn w:val="Norml"/>
+    <w:next w:val="Norml"/>
+    <w:link w:val="Cmsor2Char"/>
     <w:uiPriority w:val="9"/>
     <w:unhideWhenUsed/>
     <w:qFormat/>
@@ -3373,13 +4341,12 @@
       <w:szCs w:val="26"/>
     </w:rPr>
   </w:style>
-  <w:style w:type="character" w:default="1" w:styleId="DefaultParagraphFont">
+  <w:style w:type="character" w:default="1" w:styleId="Bekezdsalapbettpusa">
     <w:name w:val="Default Paragraph Font"/>
     <w:uiPriority w:val="1"/>
-    <w:semiHidden/>
     <w:unhideWhenUsed/>
   </w:style>
-  <w:style w:type="table" w:default="1" w:styleId="TableNormal">
+  <w:style w:type="table" w:default="1" w:styleId="Normltblzat">
     <w:name w:val="Normal Table"/>
     <w:uiPriority w:val="99"/>
     <w:semiHidden/>
@@ -3394,15 +4361,15 @@
       </w:tblCellMar>
     </w:tblPr>
   </w:style>
-  <w:style w:type="numbering" w:default="1" w:styleId="NoList">
+  <w:style w:type="numbering" w:default="1" w:styleId="Nemlista">
     <w:name w:val="No List"/>
     <w:uiPriority w:val="99"/>
     <w:semiHidden/>
     <w:unhideWhenUsed/>
   </w:style>
-  <w:style w:type="paragraph" w:styleId="NormalWeb">
+  <w:style w:type="paragraph" w:styleId="NormlWeb">
     <w:name w:val="Normal (Web)"/>
-    <w:basedOn w:val="Normal"/>
+    <w:basedOn w:val="Norml"/>
     <w:uiPriority w:val="99"/>
     <w:unhideWhenUsed/>
     <w:rsid w:val="002C7D0F"/>
@@ -3418,12 +4385,12 @@
   </w:style>
   <w:style w:type="character" w:customStyle="1" w:styleId="whitespace-normal">
     <w:name w:val="whitespace-normal"/>
-    <w:basedOn w:val="DefaultParagraphFont"/>
+    <w:basedOn w:val="Bekezdsalapbettpusa"/>
     <w:rsid w:val="002C7D0F"/>
   </w:style>
-  <w:style w:type="paragraph" w:styleId="ListParagraph">
+  <w:style w:type="paragraph" w:styleId="Listaszerbekezds">
     <w:name w:val="List Paragraph"/>
-    <w:basedOn w:val="Normal"/>
+    <w:basedOn w:val="Norml"/>
     <w:uiPriority w:val="34"/>
     <w:qFormat/>
     <w:rsid w:val="004F090F"/>
@@ -3432,9 +4399,9 @@
       <w:contextualSpacing/>
     </w:pPr>
   </w:style>
-  <w:style w:type="character" w:styleId="Hyperlink">
+  <w:style w:type="character" w:styleId="Hiperhivatkozs">
     <w:name w:val="Hyperlink"/>
-    <w:basedOn w:val="DefaultParagraphFont"/>
+    <w:basedOn w:val="Bekezdsalapbettpusa"/>
     <w:uiPriority w:val="99"/>
     <w:unhideWhenUsed/>
     <w:rsid w:val="00734445"/>
@@ -3443,10 +4410,10 @@
       <w:u w:val="single"/>
     </w:rPr>
   </w:style>
-  <w:style w:type="character" w:customStyle="1" w:styleId="Heading1Char">
-    <w:name w:val="Heading 1 Char"/>
-    <w:basedOn w:val="DefaultParagraphFont"/>
-    <w:link w:val="Heading1"/>
+  <w:style w:type="character" w:customStyle="1" w:styleId="Cmsor1Char">
+    <w:name w:val="Címsor 1 Char"/>
+    <w:basedOn w:val="Bekezdsalapbettpusa"/>
+    <w:link w:val="Cmsor1"/>
     <w:uiPriority w:val="9"/>
     <w:rsid w:val="00402772"/>
     <w:rPr>
@@ -3455,10 +4422,10 @@
       <w:szCs w:val="32"/>
     </w:rPr>
   </w:style>
-  <w:style w:type="character" w:customStyle="1" w:styleId="Heading2Char">
-    <w:name w:val="Heading 2 Char"/>
-    <w:basedOn w:val="DefaultParagraphFont"/>
-    <w:link w:val="Heading2"/>
+  <w:style w:type="character" w:customStyle="1" w:styleId="Cmsor2Char">
+    <w:name w:val="Címsor 2 Char"/>
+    <w:basedOn w:val="Bekezdsalapbettpusa"/>
+    <w:link w:val="Cmsor2"/>
     <w:uiPriority w:val="9"/>
     <w:rsid w:val="001969A1"/>
     <w:rPr>
@@ -3467,9 +4434,9 @@
       <w:szCs w:val="26"/>
     </w:rPr>
   </w:style>
-  <w:style w:type="character" w:styleId="UnresolvedMention">
+  <w:style w:type="character" w:styleId="Feloldatlanmegemlts">
     <w:name w:val="Unresolved Mention"/>
-    <w:basedOn w:val="DefaultParagraphFont"/>
+    <w:basedOn w:val="Bekezdsalapbettpusa"/>
     <w:uiPriority w:val="99"/>
     <w:semiHidden/>
     <w:unhideWhenUsed/>

</xml_diff>